<commit_message>
Fix report table alignment and spacing
</commit_message>
<xml_diff>
--- a/output/AI_Risk_Sentiment_2026_Report.docx
+++ b/output/AI_Risk_Sentiment_2026_Report.docx
@@ -100,8 +100,8 @@
             <w:vAlign w:val="center"/>
             <w:shd w:fill="254C45"/>
             <w:tcMar>
-              <w:top w:w="65" w:type="dxa"/>
-              <w:bottom w:w="65" w:type="dxa"/>
+              <w:top w:w="85" w:type="dxa"/>
+              <w:bottom w:w="85" w:type="dxa"/>
               <w:left w:w="95" w:type="dxa"/>
               <w:right w:w="95" w:type="dxa"/>
             </w:tcMar>
@@ -115,12 +115,13 @@
           <w:p>
             <w:pPr>
               <w:spacing w:after="0" w:before="0" w:line="240" w:lineRule="auto"/>
+              <w:jc w:val="left"/>
             </w:pPr>
             <w:r>
               <w:rPr>
                 <w:b/>
                 <w:color w:val="FFFFFF"/>
-                <w:sz w:val="18"/>
+                <w:sz w:val="19"/>
               </w:rPr>
               <w:t>Stream</w:t>
             </w:r>
@@ -132,8 +133,8 @@
             <w:vAlign w:val="center"/>
             <w:shd w:fill="254C45"/>
             <w:tcMar>
-              <w:top w:w="65" w:type="dxa"/>
-              <w:bottom w:w="65" w:type="dxa"/>
+              <w:top w:w="85" w:type="dxa"/>
+              <w:bottom w:w="85" w:type="dxa"/>
               <w:left w:w="95" w:type="dxa"/>
               <w:right w:w="95" w:type="dxa"/>
             </w:tcMar>
@@ -147,12 +148,13 @@
           <w:p>
             <w:pPr>
               <w:spacing w:after="0" w:before="0" w:line="240" w:lineRule="auto"/>
+              <w:jc w:val="left"/>
             </w:pPr>
             <w:r>
               <w:rPr>
                 <w:b/>
                 <w:color w:val="FFFFFF"/>
-                <w:sz w:val="18"/>
+                <w:sz w:val="19"/>
               </w:rPr>
               <w:t>Coverage after cleaning</w:t>
             </w:r>
@@ -164,8 +166,8 @@
             <w:vAlign w:val="center"/>
             <w:shd w:fill="254C45"/>
             <w:tcMar>
-              <w:top w:w="65" w:type="dxa"/>
-              <w:bottom w:w="65" w:type="dxa"/>
+              <w:top w:w="85" w:type="dxa"/>
+              <w:bottom w:w="85" w:type="dxa"/>
               <w:left w:w="95" w:type="dxa"/>
               <w:right w:w="95" w:type="dxa"/>
             </w:tcMar>
@@ -179,13 +181,13 @@
           <w:p>
             <w:pPr>
               <w:spacing w:after="0" w:before="0" w:line="240" w:lineRule="auto"/>
-              <w:jc w:val="center"/>
+              <w:jc w:val="left"/>
             </w:pPr>
             <w:r>
               <w:rPr>
                 <w:b/>
                 <w:color w:val="FFFFFF"/>
-                <w:sz w:val="18"/>
+                <w:sz w:val="19"/>
               </w:rPr>
               <w:t>Unit and treatment</w:t>
             </w:r>
@@ -202,8 +204,8 @@
             <w:vAlign w:val="center"/>
             <w:shd w:fill="FFFFFF"/>
             <w:tcMar>
-              <w:top w:w="65" w:type="dxa"/>
-              <w:bottom w:w="65" w:type="dxa"/>
+              <w:top w:w="85" w:type="dxa"/>
+              <w:bottom w:w="85" w:type="dxa"/>
               <w:left w:w="95" w:type="dxa"/>
               <w:right w:w="95" w:type="dxa"/>
             </w:tcMar>
@@ -217,12 +219,13 @@
           <w:p>
             <w:pPr>
               <w:spacing w:after="0" w:before="0" w:line="240" w:lineRule="auto"/>
+              <w:jc w:val="left"/>
             </w:pPr>
             <w:r>
               <w:rPr>
                 <w:b w:val="0"/>
                 <w:color w:val="242424"/>
-                <w:sz w:val="18"/>
+                <w:sz w:val="19"/>
               </w:rPr>
               <w:t>News</w:t>
             </w:r>
@@ -234,8 +237,8 @@
             <w:vAlign w:val="center"/>
             <w:shd w:fill="FFFFFF"/>
             <w:tcMar>
-              <w:top w:w="65" w:type="dxa"/>
-              <w:bottom w:w="65" w:type="dxa"/>
+              <w:top w:w="85" w:type="dxa"/>
+              <w:bottom w:w="85" w:type="dxa"/>
               <w:left w:w="95" w:type="dxa"/>
               <w:right w:w="95" w:type="dxa"/>
             </w:tcMar>
@@ -249,12 +252,13 @@
           <w:p>
             <w:pPr>
               <w:spacing w:after="0" w:before="0" w:line="240" w:lineRule="auto"/>
+              <w:jc w:val="left"/>
             </w:pPr>
             <w:r>
               <w:rPr>
                 <w:b w:val="0"/>
                 <w:color w:val="242424"/>
-                <w:sz w:val="18"/>
+                <w:sz w:val="19"/>
               </w:rPr>
               <w:t>831 headlines; 133 domains</w:t>
             </w:r>
@@ -266,8 +270,8 @@
             <w:vAlign w:val="center"/>
             <w:shd w:fill="FFFFFF"/>
             <w:tcMar>
-              <w:top w:w="65" w:type="dxa"/>
-              <w:bottom w:w="65" w:type="dxa"/>
+              <w:top w:w="85" w:type="dxa"/>
+              <w:bottom w:w="85" w:type="dxa"/>
               <w:left w:w="95" w:type="dxa"/>
               <w:right w:w="95" w:type="dxa"/>
             </w:tcMar>
@@ -281,12 +285,13 @@
           <w:p>
             <w:pPr>
               <w:spacing w:after="0" w:before="0" w:line="240" w:lineRule="auto"/>
+              <w:jc w:val="left"/>
             </w:pPr>
             <w:r>
               <w:rPr>
                 <w:b w:val="0"/>
                 <w:color w:val="242424"/>
-                <w:sz w:val="18"/>
+                <w:sz w:val="19"/>
               </w:rPr>
               <w:t>23 daily archives; company releases excluded</w:t>
             </w:r>
@@ -303,8 +308,8 @@
             <w:vAlign w:val="center"/>
             <w:shd w:fill="F3F6F5"/>
             <w:tcMar>
-              <w:top w:w="65" w:type="dxa"/>
-              <w:bottom w:w="65" w:type="dxa"/>
+              <w:top w:w="85" w:type="dxa"/>
+              <w:bottom w:w="85" w:type="dxa"/>
               <w:left w:w="95" w:type="dxa"/>
               <w:right w:w="95" w:type="dxa"/>
             </w:tcMar>
@@ -318,12 +323,13 @@
           <w:p>
             <w:pPr>
               <w:spacing w:after="0" w:before="0" w:line="240" w:lineRule="auto"/>
+              <w:jc w:val="left"/>
             </w:pPr>
             <w:r>
               <w:rPr>
                 <w:b w:val="0"/>
                 <w:color w:val="242424"/>
-                <w:sz w:val="18"/>
+                <w:sz w:val="19"/>
               </w:rPr>
               <w:t>Twitter and X</w:t>
             </w:r>
@@ -335,8 +341,8 @@
             <w:vAlign w:val="center"/>
             <w:shd w:fill="F3F6F5"/>
             <w:tcMar>
-              <w:top w:w="65" w:type="dxa"/>
-              <w:bottom w:w="65" w:type="dxa"/>
+              <w:top w:w="85" w:type="dxa"/>
+              <w:bottom w:w="85" w:type="dxa"/>
               <w:left w:w="95" w:type="dxa"/>
               <w:right w:w="95" w:type="dxa"/>
             </w:tcMar>
@@ -350,12 +356,13 @@
           <w:p>
             <w:pPr>
               <w:spacing w:after="0" w:before="0" w:line="240" w:lineRule="auto"/>
+              <w:jc w:val="left"/>
             </w:pPr>
             <w:r>
               <w:rPr>
                 <w:b w:val="0"/>
                 <w:color w:val="242424"/>
-                <w:sz w:val="18"/>
+                <w:sz w:val="19"/>
               </w:rPr>
               <w:t>7,461 posts; 6,793 authors</w:t>
             </w:r>
@@ -367,8 +374,8 @@
             <w:vAlign w:val="center"/>
             <w:shd w:fill="F3F6F5"/>
             <w:tcMar>
-              <w:top w:w="65" w:type="dxa"/>
-              <w:bottom w:w="65" w:type="dxa"/>
+              <w:top w:w="85" w:type="dxa"/>
+              <w:bottom w:w="85" w:type="dxa"/>
               <w:left w:w="95" w:type="dxa"/>
               <w:right w:w="95" w:type="dxa"/>
             </w:tcMar>
@@ -382,12 +389,13 @@
           <w:p>
             <w:pPr>
               <w:spacing w:after="0" w:before="0" w:line="240" w:lineRule="auto"/>
+              <w:jc w:val="left"/>
             </w:pPr>
             <w:r>
               <w:rPr>
                 <w:b w:val="0"/>
                 <w:color w:val="242424"/>
-                <w:sz w:val="18"/>
+                <w:sz w:val="19"/>
               </w:rPr>
               <w:t>English; ≥100 followers and ≥100 views</w:t>
             </w:r>
@@ -404,8 +412,8 @@
             <w:vAlign w:val="center"/>
             <w:shd w:fill="FFFFFF"/>
             <w:tcMar>
-              <w:top w:w="65" w:type="dxa"/>
-              <w:bottom w:w="65" w:type="dxa"/>
+              <w:top w:w="85" w:type="dxa"/>
+              <w:bottom w:w="85" w:type="dxa"/>
               <w:left w:w="95" w:type="dxa"/>
               <w:right w:w="95" w:type="dxa"/>
             </w:tcMar>
@@ -419,12 +427,13 @@
           <w:p>
             <w:pPr>
               <w:spacing w:after="0" w:before="0" w:line="240" w:lineRule="auto"/>
+              <w:jc w:val="left"/>
             </w:pPr>
             <w:r>
               <w:rPr>
                 <w:b w:val="0"/>
                 <w:color w:val="242424"/>
-                <w:sz w:val="18"/>
+                <w:sz w:val="19"/>
               </w:rPr>
               <w:t>Company releases</w:t>
             </w:r>
@@ -436,8 +445,8 @@
             <w:vAlign w:val="center"/>
             <w:shd w:fill="FFFFFF"/>
             <w:tcMar>
-              <w:top w:w="65" w:type="dxa"/>
-              <w:bottom w:w="65" w:type="dxa"/>
+              <w:top w:w="85" w:type="dxa"/>
+              <w:bottom w:w="85" w:type="dxa"/>
               <w:left w:w="95" w:type="dxa"/>
               <w:right w:w="95" w:type="dxa"/>
             </w:tcMar>
@@ -451,13 +460,13 @@
           <w:p>
             <w:pPr>
               <w:spacing w:after="0" w:before="0" w:line="240" w:lineRule="auto"/>
-              <w:jc w:val="center"/>
+              <w:jc w:val="left"/>
             </w:pPr>
             <w:r>
               <w:rPr>
                 <w:b w:val="0"/>
                 <w:color w:val="242424"/>
-                <w:sz w:val="18"/>
+                <w:sz w:val="19"/>
               </w:rPr>
               <w:t>175 headlines</w:t>
             </w:r>
@@ -469,8 +478,8 @@
             <w:vAlign w:val="center"/>
             <w:shd w:fill="FFFFFF"/>
             <w:tcMar>
-              <w:top w:w="65" w:type="dxa"/>
-              <w:bottom w:w="65" w:type="dxa"/>
+              <w:top w:w="85" w:type="dxa"/>
+              <w:bottom w:w="85" w:type="dxa"/>
               <w:left w:w="95" w:type="dxa"/>
               <w:right w:w="95" w:type="dxa"/>
             </w:tcMar>
@@ -484,12 +493,13 @@
           <w:p>
             <w:pPr>
               <w:spacing w:after="0" w:before="0" w:line="240" w:lineRule="auto"/>
+              <w:jc w:val="left"/>
             </w:pPr>
             <w:r>
               <w:rPr>
                 <w:b w:val="0"/>
                 <w:color w:val="242424"/>
-                <w:sz w:val="18"/>
+                <w:sz w:val="19"/>
               </w:rPr>
               <w:t>Separate framing comparator</w:t>
             </w:r>
@@ -506,8 +516,8 @@
             <w:vAlign w:val="center"/>
             <w:shd w:fill="F3F6F5"/>
             <w:tcMar>
-              <w:top w:w="65" w:type="dxa"/>
-              <w:bottom w:w="65" w:type="dxa"/>
+              <w:top w:w="85" w:type="dxa"/>
+              <w:bottom w:w="85" w:type="dxa"/>
               <w:left w:w="95" w:type="dxa"/>
               <w:right w:w="95" w:type="dxa"/>
             </w:tcMar>
@@ -521,12 +531,13 @@
           <w:p>
             <w:pPr>
               <w:spacing w:after="0" w:before="0" w:line="240" w:lineRule="auto"/>
+              <w:jc w:val="left"/>
             </w:pPr>
             <w:r>
               <w:rPr>
                 <w:b w:val="0"/>
                 <w:color w:val="242424"/>
-                <w:sz w:val="18"/>
+                <w:sz w:val="19"/>
               </w:rPr>
               <w:t>Market prices</w:t>
             </w:r>
@@ -538,8 +549,8 @@
             <w:vAlign w:val="center"/>
             <w:shd w:fill="F3F6F5"/>
             <w:tcMar>
-              <w:top w:w="65" w:type="dxa"/>
-              <w:bottom w:w="65" w:type="dxa"/>
+              <w:top w:w="85" w:type="dxa"/>
+              <w:bottom w:w="85" w:type="dxa"/>
               <w:left w:w="95" w:type="dxa"/>
               <w:right w:w="95" w:type="dxa"/>
             </w:tcMar>
@@ -553,12 +564,13 @@
           <w:p>
             <w:pPr>
               <w:spacing w:after="0" w:before="0" w:line="240" w:lineRule="auto"/>
+              <w:jc w:val="left"/>
             </w:pPr>
             <w:r>
               <w:rPr>
                 <w:b w:val="0"/>
                 <w:color w:val="242424"/>
-                <w:sz w:val="18"/>
+                <w:sz w:val="19"/>
               </w:rPr>
               <w:t>23 equities, SPY and QQQ</w:t>
             </w:r>
@@ -570,8 +582,8 @@
             <w:vAlign w:val="center"/>
             <w:shd w:fill="F3F6F5"/>
             <w:tcMar>
-              <w:top w:w="65" w:type="dxa"/>
-              <w:bottom w:w="65" w:type="dxa"/>
+              <w:top w:w="85" w:type="dxa"/>
+              <w:bottom w:w="85" w:type="dxa"/>
               <w:left w:w="95" w:type="dxa"/>
               <w:right w:w="95" w:type="dxa"/>
             </w:tcMar>
@@ -585,12 +597,13 @@
           <w:p>
             <w:pPr>
               <w:spacing w:after="0" w:before="0" w:line="240" w:lineRule="auto"/>
+              <w:jc w:val="left"/>
             </w:pPr>
             <w:r>
               <w:rPr>
                 <w:b w:val="0"/>
                 <w:color w:val="242424"/>
-                <w:sz w:val="18"/>
+                <w:sz w:val="19"/>
               </w:rPr>
               <w:t>17 sessions plus September 4 baseline</w:t>
             </w:r>
@@ -601,6 +614,7 @@
     <w:p>
       <w:pPr>
         <w:pStyle w:val="Caption"/>
+        <w:spacing w:before="80"/>
       </w:pPr>
       <w:r>
         <w:t>Sources: DataAIHub daily archives [2], TwitterAPI.io advanced search [3], and Yahoo Finance adjusted closes [4]. News and X are selected samples, not population censuses.</w:t>
@@ -636,8 +650,8 @@
             <w:vAlign w:val="center"/>
             <w:shd w:fill="254C45"/>
             <w:tcMar>
-              <w:top w:w="65" w:type="dxa"/>
-              <w:bottom w:w="65" w:type="dxa"/>
+              <w:top w:w="85" w:type="dxa"/>
+              <w:bottom w:w="85" w:type="dxa"/>
               <w:left w:w="95" w:type="dxa"/>
               <w:right w:w="95" w:type="dxa"/>
             </w:tcMar>
@@ -651,12 +665,13 @@
           <w:p>
             <w:pPr>
               <w:spacing w:after="0" w:before="0" w:line="240" w:lineRule="auto"/>
+              <w:jc w:val="left"/>
             </w:pPr>
             <w:r>
               <w:rPr>
                 <w:b/>
                 <w:color w:val="FFFFFF"/>
-                <w:sz w:val="18"/>
+                <w:sz w:val="19"/>
               </w:rPr>
               <w:t>AI exposure</w:t>
             </w:r>
@@ -668,8 +683,8 @@
             <w:vAlign w:val="center"/>
             <w:shd w:fill="254C45"/>
             <w:tcMar>
-              <w:top w:w="65" w:type="dxa"/>
-              <w:bottom w:w="65" w:type="dxa"/>
+              <w:top w:w="85" w:type="dxa"/>
+              <w:bottom w:w="85" w:type="dxa"/>
               <w:left w:w="95" w:type="dxa"/>
               <w:right w:w="95" w:type="dxa"/>
             </w:tcMar>
@@ -683,13 +698,13 @@
           <w:p>
             <w:pPr>
               <w:spacing w:after="0" w:before="0" w:line="240" w:lineRule="auto"/>
-              <w:jc w:val="center"/>
+              <w:jc w:val="left"/>
             </w:pPr>
             <w:r>
               <w:rPr>
                 <w:b/>
                 <w:color w:val="FFFFFF"/>
-                <w:sz w:val="18"/>
+                <w:sz w:val="19"/>
               </w:rPr>
               <w:t>Tickers</w:t>
             </w:r>
@@ -706,8 +721,8 @@
             <w:vAlign w:val="center"/>
             <w:shd w:fill="FFFFFF"/>
             <w:tcMar>
-              <w:top w:w="65" w:type="dxa"/>
-              <w:bottom w:w="65" w:type="dxa"/>
+              <w:top w:w="85" w:type="dxa"/>
+              <w:bottom w:w="85" w:type="dxa"/>
               <w:left w:w="95" w:type="dxa"/>
               <w:right w:w="95" w:type="dxa"/>
             </w:tcMar>
@@ -721,12 +736,13 @@
           <w:p>
             <w:pPr>
               <w:spacing w:after="0" w:before="0" w:line="240" w:lineRule="auto"/>
+              <w:jc w:val="left"/>
             </w:pPr>
             <w:r>
               <w:rPr>
                 <w:b w:val="0"/>
                 <w:color w:val="242424"/>
-                <w:sz w:val="18"/>
+                <w:sz w:val="19"/>
               </w:rPr>
               <w:t>Semiconductors</w:t>
             </w:r>
@@ -738,8 +754,8 @@
             <w:vAlign w:val="center"/>
             <w:shd w:fill="FFFFFF"/>
             <w:tcMar>
-              <w:top w:w="65" w:type="dxa"/>
-              <w:bottom w:w="65" w:type="dxa"/>
+              <w:top w:w="85" w:type="dxa"/>
+              <w:bottom w:w="85" w:type="dxa"/>
               <w:left w:w="95" w:type="dxa"/>
               <w:right w:w="95" w:type="dxa"/>
             </w:tcMar>
@@ -753,12 +769,13 @@
           <w:p>
             <w:pPr>
               <w:spacing w:after="0" w:before="0" w:line="240" w:lineRule="auto"/>
+              <w:jc w:val="left"/>
             </w:pPr>
             <w:r>
               <w:rPr>
                 <w:b w:val="0"/>
                 <w:color w:val="242424"/>
-                <w:sz w:val="18"/>
+                <w:sz w:val="19"/>
               </w:rPr>
               <w:t>NVDA, AMD, AVGO, ARM, MU, TSM, ASML, MRVL</w:t>
             </w:r>
@@ -775,8 +792,8 @@
             <w:vAlign w:val="center"/>
             <w:shd w:fill="F3F6F5"/>
             <w:tcMar>
-              <w:top w:w="65" w:type="dxa"/>
-              <w:bottom w:w="65" w:type="dxa"/>
+              <w:top w:w="85" w:type="dxa"/>
+              <w:bottom w:w="85" w:type="dxa"/>
               <w:left w:w="95" w:type="dxa"/>
               <w:right w:w="95" w:type="dxa"/>
             </w:tcMar>
@@ -790,12 +807,13 @@
           <w:p>
             <w:pPr>
               <w:spacing w:after="0" w:before="0" w:line="240" w:lineRule="auto"/>
+              <w:jc w:val="left"/>
             </w:pPr>
             <w:r>
               <w:rPr>
                 <w:b w:val="0"/>
                 <w:color w:val="242424"/>
-                <w:sz w:val="18"/>
+                <w:sz w:val="19"/>
               </w:rPr>
               <w:t>Cloud and platforms</w:t>
             </w:r>
@@ -807,8 +825,8 @@
             <w:vAlign w:val="center"/>
             <w:shd w:fill="F3F6F5"/>
             <w:tcMar>
-              <w:top w:w="65" w:type="dxa"/>
-              <w:bottom w:w="65" w:type="dxa"/>
+              <w:top w:w="85" w:type="dxa"/>
+              <w:bottom w:w="85" w:type="dxa"/>
               <w:left w:w="95" w:type="dxa"/>
               <w:right w:w="95" w:type="dxa"/>
             </w:tcMar>
@@ -822,12 +840,13 @@
           <w:p>
             <w:pPr>
               <w:spacing w:after="0" w:before="0" w:line="240" w:lineRule="auto"/>
+              <w:jc w:val="left"/>
             </w:pPr>
             <w:r>
               <w:rPr>
                 <w:b w:val="0"/>
                 <w:color w:val="242424"/>
-                <w:sz w:val="18"/>
+                <w:sz w:val="19"/>
               </w:rPr>
               <w:t>MSFT, GOOGL, AMZN, META, ORCL, IBM</w:t>
             </w:r>
@@ -844,8 +863,8 @@
             <w:vAlign w:val="center"/>
             <w:shd w:fill="FFFFFF"/>
             <w:tcMar>
-              <w:top w:w="65" w:type="dxa"/>
-              <w:bottom w:w="65" w:type="dxa"/>
+              <w:top w:w="85" w:type="dxa"/>
+              <w:bottom w:w="85" w:type="dxa"/>
               <w:left w:w="95" w:type="dxa"/>
               <w:right w:w="95" w:type="dxa"/>
             </w:tcMar>
@@ -859,12 +878,13 @@
           <w:p>
             <w:pPr>
               <w:spacing w:after="0" w:before="0" w:line="240" w:lineRule="auto"/>
+              <w:jc w:val="left"/>
             </w:pPr>
             <w:r>
               <w:rPr>
                 <w:b w:val="0"/>
                 <w:color w:val="242424"/>
-                <w:sz w:val="18"/>
+                <w:sz w:val="19"/>
               </w:rPr>
               <w:t>Enterprise software</w:t>
             </w:r>
@@ -876,8 +896,8 @@
             <w:vAlign w:val="center"/>
             <w:shd w:fill="FFFFFF"/>
             <w:tcMar>
-              <w:top w:w="65" w:type="dxa"/>
-              <w:bottom w:w="65" w:type="dxa"/>
+              <w:top w:w="85" w:type="dxa"/>
+              <w:bottom w:w="85" w:type="dxa"/>
               <w:left w:w="95" w:type="dxa"/>
               <w:right w:w="95" w:type="dxa"/>
             </w:tcMar>
@@ -891,12 +911,13 @@
           <w:p>
             <w:pPr>
               <w:spacing w:after="0" w:before="0" w:line="240" w:lineRule="auto"/>
+              <w:jc w:val="left"/>
             </w:pPr>
             <w:r>
               <w:rPr>
                 <w:b w:val="0"/>
                 <w:color w:val="242424"/>
-                <w:sz w:val="18"/>
+                <w:sz w:val="19"/>
               </w:rPr>
               <w:t>PLTR, CRM, NOW, ADBE, SNOW</w:t>
             </w:r>
@@ -913,8 +934,8 @@
             <w:vAlign w:val="center"/>
             <w:shd w:fill="F3F6F5"/>
             <w:tcMar>
-              <w:top w:w="65" w:type="dxa"/>
-              <w:bottom w:w="65" w:type="dxa"/>
+              <w:top w:w="85" w:type="dxa"/>
+              <w:bottom w:w="85" w:type="dxa"/>
               <w:left w:w="95" w:type="dxa"/>
               <w:right w:w="95" w:type="dxa"/>
             </w:tcMar>
@@ -928,12 +949,13 @@
           <w:p>
             <w:pPr>
               <w:spacing w:after="0" w:before="0" w:line="240" w:lineRule="auto"/>
+              <w:jc w:val="left"/>
             </w:pPr>
             <w:r>
               <w:rPr>
                 <w:b w:val="0"/>
                 <w:color w:val="242424"/>
-                <w:sz w:val="18"/>
+                <w:sz w:val="19"/>
               </w:rPr>
               <w:t>Servers and autonomy</w:t>
             </w:r>
@@ -945,8 +967,8 @@
             <w:vAlign w:val="center"/>
             <w:shd w:fill="F3F6F5"/>
             <w:tcMar>
-              <w:top w:w="65" w:type="dxa"/>
-              <w:bottom w:w="65" w:type="dxa"/>
+              <w:top w:w="85" w:type="dxa"/>
+              <w:bottom w:w="85" w:type="dxa"/>
               <w:left w:w="95" w:type="dxa"/>
               <w:right w:w="95" w:type="dxa"/>
             </w:tcMar>
@@ -960,12 +982,13 @@
           <w:p>
             <w:pPr>
               <w:spacing w:after="0" w:before="0" w:line="240" w:lineRule="auto"/>
+              <w:jc w:val="left"/>
             </w:pPr>
             <w:r>
               <w:rPr>
                 <w:b w:val="0"/>
                 <w:color w:val="242424"/>
-                <w:sz w:val="18"/>
+                <w:sz w:val="19"/>
               </w:rPr>
               <w:t>DELL, HPE, SMCI; TSLA</w:t>
             </w:r>
@@ -1075,8 +1098,8 @@
             <w:vAlign w:val="center"/>
             <w:shd w:fill="254C45"/>
             <w:tcMar>
-              <w:top w:w="65" w:type="dxa"/>
-              <w:bottom w:w="65" w:type="dxa"/>
+              <w:top w:w="85" w:type="dxa"/>
+              <w:bottom w:w="85" w:type="dxa"/>
               <w:left w:w="95" w:type="dxa"/>
               <w:right w:w="95" w:type="dxa"/>
             </w:tcMar>
@@ -1090,12 +1113,13 @@
           <w:p>
             <w:pPr>
               <w:spacing w:after="0" w:before="0" w:line="240" w:lineRule="auto"/>
+              <w:jc w:val="left"/>
             </w:pPr>
             <w:r>
               <w:rPr>
                 <w:b/>
                 <w:color w:val="FFFFFF"/>
-                <w:sz w:val="18"/>
+                <w:sz w:val="19"/>
               </w:rPr>
               <w:t>Window</w:t>
             </w:r>
@@ -1107,8 +1131,8 @@
             <w:vAlign w:val="center"/>
             <w:shd w:fill="254C45"/>
             <w:tcMar>
-              <w:top w:w="65" w:type="dxa"/>
-              <w:bottom w:w="65" w:type="dxa"/>
+              <w:top w:w="85" w:type="dxa"/>
+              <w:bottom w:w="85" w:type="dxa"/>
               <w:left w:w="95" w:type="dxa"/>
               <w:right w:w="95" w:type="dxa"/>
             </w:tcMar>
@@ -1128,7 +1152,7 @@
               <w:rPr>
                 <w:b/>
                 <w:color w:val="FFFFFF"/>
-                <w:sz w:val="18"/>
+                <w:sz w:val="19"/>
               </w:rPr>
               <w:t>News VADER</w:t>
             </w:r>
@@ -1140,8 +1164,8 @@
             <w:vAlign w:val="center"/>
             <w:shd w:fill="254C45"/>
             <w:tcMar>
-              <w:top w:w="65" w:type="dxa"/>
-              <w:bottom w:w="65" w:type="dxa"/>
+              <w:top w:w="85" w:type="dxa"/>
+              <w:bottom w:w="85" w:type="dxa"/>
               <w:left w:w="95" w:type="dxa"/>
               <w:right w:w="95" w:type="dxa"/>
             </w:tcMar>
@@ -1161,7 +1185,7 @@
               <w:rPr>
                 <w:b/>
                 <w:color w:val="FFFFFF"/>
-                <w:sz w:val="18"/>
+                <w:sz w:val="19"/>
               </w:rPr>
               <w:t>News RoBERTa</w:t>
             </w:r>
@@ -1173,8 +1197,8 @@
             <w:vAlign w:val="center"/>
             <w:shd w:fill="254C45"/>
             <w:tcMar>
-              <w:top w:w="65" w:type="dxa"/>
-              <w:bottom w:w="65" w:type="dxa"/>
+              <w:top w:w="85" w:type="dxa"/>
+              <w:bottom w:w="85" w:type="dxa"/>
               <w:left w:w="95" w:type="dxa"/>
               <w:right w:w="95" w:type="dxa"/>
             </w:tcMar>
@@ -1194,7 +1218,7 @@
               <w:rPr>
                 <w:b/>
                 <w:color w:val="FFFFFF"/>
-                <w:sz w:val="18"/>
+                <w:sz w:val="19"/>
               </w:rPr>
               <w:t>X VADER</w:t>
             </w:r>
@@ -1206,8 +1230,8 @@
             <w:vAlign w:val="center"/>
             <w:shd w:fill="254C45"/>
             <w:tcMar>
-              <w:top w:w="65" w:type="dxa"/>
-              <w:bottom w:w="65" w:type="dxa"/>
+              <w:top w:w="85" w:type="dxa"/>
+              <w:bottom w:w="85" w:type="dxa"/>
               <w:left w:w="95" w:type="dxa"/>
               <w:right w:w="95" w:type="dxa"/>
             </w:tcMar>
@@ -1227,7 +1251,7 @@
               <w:rPr>
                 <w:b/>
                 <w:color w:val="FFFFFF"/>
-                <w:sz w:val="18"/>
+                <w:sz w:val="19"/>
               </w:rPr>
               <w:t>X RoBERTa</w:t>
             </w:r>
@@ -1244,8 +1268,8 @@
             <w:vAlign w:val="center"/>
             <w:shd w:fill="FFFFFF"/>
             <w:tcMar>
-              <w:top w:w="65" w:type="dxa"/>
-              <w:bottom w:w="65" w:type="dxa"/>
+              <w:top w:w="85" w:type="dxa"/>
+              <w:bottom w:w="85" w:type="dxa"/>
               <w:left w:w="95" w:type="dxa"/>
               <w:right w:w="95" w:type="dxa"/>
             </w:tcMar>
@@ -1259,12 +1283,13 @@
           <w:p>
             <w:pPr>
               <w:spacing w:after="0" w:before="0" w:line="240" w:lineRule="auto"/>
+              <w:jc w:val="left"/>
             </w:pPr>
             <w:r>
               <w:rPr>
                 <w:b w:val="0"/>
                 <w:color w:val="242424"/>
-                <w:sz w:val="18"/>
+                <w:sz w:val="19"/>
               </w:rPr>
               <w:t>Sep 8-14</w:t>
             </w:r>
@@ -1276,8 +1301,8 @@
             <w:vAlign w:val="center"/>
             <w:shd w:fill="FFFFFF"/>
             <w:tcMar>
-              <w:top w:w="65" w:type="dxa"/>
-              <w:bottom w:w="65" w:type="dxa"/>
+              <w:top w:w="85" w:type="dxa"/>
+              <w:bottom w:w="85" w:type="dxa"/>
               <w:left w:w="95" w:type="dxa"/>
               <w:right w:w="95" w:type="dxa"/>
             </w:tcMar>
@@ -1297,7 +1322,7 @@
               <w:rPr>
                 <w:b w:val="0"/>
                 <w:color w:val="242424"/>
-                <w:sz w:val="18"/>
+                <w:sz w:val="19"/>
               </w:rPr>
               <w:t>34.6%</w:t>
             </w:r>
@@ -1309,8 +1334,8 @@
             <w:vAlign w:val="center"/>
             <w:shd w:fill="FFFFFF"/>
             <w:tcMar>
-              <w:top w:w="65" w:type="dxa"/>
-              <w:bottom w:w="65" w:type="dxa"/>
+              <w:top w:w="85" w:type="dxa"/>
+              <w:bottom w:w="85" w:type="dxa"/>
               <w:left w:w="95" w:type="dxa"/>
               <w:right w:w="95" w:type="dxa"/>
             </w:tcMar>
@@ -1330,7 +1355,7 @@
               <w:rPr>
                 <w:b w:val="0"/>
                 <w:color w:val="242424"/>
-                <w:sz w:val="18"/>
+                <w:sz w:val="19"/>
               </w:rPr>
               <w:t>17.1%</w:t>
             </w:r>
@@ -1342,8 +1367,8 @@
             <w:vAlign w:val="center"/>
             <w:shd w:fill="FFFFFF"/>
             <w:tcMar>
-              <w:top w:w="65" w:type="dxa"/>
-              <w:bottom w:w="65" w:type="dxa"/>
+              <w:top w:w="85" w:type="dxa"/>
+              <w:bottom w:w="85" w:type="dxa"/>
               <w:left w:w="95" w:type="dxa"/>
               <w:right w:w="95" w:type="dxa"/>
             </w:tcMar>
@@ -1363,7 +1388,7 @@
               <w:rPr>
                 <w:b w:val="0"/>
                 <w:color w:val="242424"/>
-                <w:sz w:val="18"/>
+                <w:sz w:val="19"/>
               </w:rPr>
               <w:t>30.5%</w:t>
             </w:r>
@@ -1375,8 +1400,8 @@
             <w:vAlign w:val="center"/>
             <w:shd w:fill="FFFFFF"/>
             <w:tcMar>
-              <w:top w:w="65" w:type="dxa"/>
-              <w:bottom w:w="65" w:type="dxa"/>
+              <w:top w:w="85" w:type="dxa"/>
+              <w:bottom w:w="85" w:type="dxa"/>
               <w:left w:w="95" w:type="dxa"/>
               <w:right w:w="95" w:type="dxa"/>
             </w:tcMar>
@@ -1396,7 +1421,7 @@
               <w:rPr>
                 <w:b w:val="0"/>
                 <w:color w:val="242424"/>
-                <w:sz w:val="18"/>
+                <w:sz w:val="19"/>
               </w:rPr>
               <w:t>34.0%</w:t>
             </w:r>
@@ -1413,8 +1438,8 @@
             <w:vAlign w:val="center"/>
             <w:shd w:fill="F3F6F5"/>
             <w:tcMar>
-              <w:top w:w="65" w:type="dxa"/>
-              <w:bottom w:w="65" w:type="dxa"/>
+              <w:top w:w="85" w:type="dxa"/>
+              <w:bottom w:w="85" w:type="dxa"/>
               <w:left w:w="95" w:type="dxa"/>
               <w:right w:w="95" w:type="dxa"/>
             </w:tcMar>
@@ -1428,12 +1453,13 @@
           <w:p>
             <w:pPr>
               <w:spacing w:after="0" w:before="0" w:line="240" w:lineRule="auto"/>
+              <w:jc w:val="left"/>
             </w:pPr>
             <w:r>
               <w:rPr>
                 <w:b w:val="0"/>
                 <w:color w:val="242424"/>
-                <w:sz w:val="18"/>
+                <w:sz w:val="19"/>
               </w:rPr>
               <w:t>Sep 15-22</w:t>
             </w:r>
@@ -1445,8 +1471,8 @@
             <w:vAlign w:val="center"/>
             <w:shd w:fill="F3F6F5"/>
             <w:tcMar>
-              <w:top w:w="65" w:type="dxa"/>
-              <w:bottom w:w="65" w:type="dxa"/>
+              <w:top w:w="85" w:type="dxa"/>
+              <w:bottom w:w="85" w:type="dxa"/>
               <w:left w:w="95" w:type="dxa"/>
               <w:right w:w="95" w:type="dxa"/>
             </w:tcMar>
@@ -1466,7 +1492,7 @@
               <w:rPr>
                 <w:b w:val="0"/>
                 <w:color w:val="242424"/>
-                <w:sz w:val="18"/>
+                <w:sz w:val="19"/>
               </w:rPr>
               <w:t>23.7%</w:t>
             </w:r>
@@ -1478,8 +1504,8 @@
             <w:vAlign w:val="center"/>
             <w:shd w:fill="F3F6F5"/>
             <w:tcMar>
-              <w:top w:w="65" w:type="dxa"/>
-              <w:bottom w:w="65" w:type="dxa"/>
+              <w:top w:w="85" w:type="dxa"/>
+              <w:bottom w:w="85" w:type="dxa"/>
               <w:left w:w="95" w:type="dxa"/>
               <w:right w:w="95" w:type="dxa"/>
             </w:tcMar>
@@ -1499,7 +1525,7 @@
               <w:rPr>
                 <w:b w:val="0"/>
                 <w:color w:val="242424"/>
-                <w:sz w:val="18"/>
+                <w:sz w:val="19"/>
               </w:rPr>
               <w:t>12.2%</w:t>
             </w:r>
@@ -1511,8 +1537,8 @@
             <w:vAlign w:val="center"/>
             <w:shd w:fill="F3F6F5"/>
             <w:tcMar>
-              <w:top w:w="65" w:type="dxa"/>
-              <w:bottom w:w="65" w:type="dxa"/>
+              <w:top w:w="85" w:type="dxa"/>
+              <w:bottom w:w="85" w:type="dxa"/>
               <w:left w:w="95" w:type="dxa"/>
               <w:right w:w="95" w:type="dxa"/>
             </w:tcMar>
@@ -1532,7 +1558,7 @@
               <w:rPr>
                 <w:b w:val="0"/>
                 <w:color w:val="242424"/>
-                <w:sz w:val="18"/>
+                <w:sz w:val="19"/>
               </w:rPr>
               <w:t>29.7%</w:t>
             </w:r>
@@ -1544,8 +1570,8 @@
             <w:vAlign w:val="center"/>
             <w:shd w:fill="F3F6F5"/>
             <w:tcMar>
-              <w:top w:w="65" w:type="dxa"/>
-              <w:bottom w:w="65" w:type="dxa"/>
+              <w:top w:w="85" w:type="dxa"/>
+              <w:bottom w:w="85" w:type="dxa"/>
               <w:left w:w="95" w:type="dxa"/>
               <w:right w:w="95" w:type="dxa"/>
             </w:tcMar>
@@ -1565,7 +1591,7 @@
               <w:rPr>
                 <w:b w:val="0"/>
                 <w:color w:val="242424"/>
-                <w:sz w:val="18"/>
+                <w:sz w:val="19"/>
               </w:rPr>
               <w:t>30.3%</w:t>
             </w:r>
@@ -1582,8 +1608,8 @@
             <w:vAlign w:val="center"/>
             <w:shd w:fill="FFFFFF"/>
             <w:tcMar>
-              <w:top w:w="65" w:type="dxa"/>
-              <w:bottom w:w="65" w:type="dxa"/>
+              <w:top w:w="85" w:type="dxa"/>
+              <w:bottom w:w="85" w:type="dxa"/>
               <w:left w:w="95" w:type="dxa"/>
               <w:right w:w="95" w:type="dxa"/>
             </w:tcMar>
@@ -1597,12 +1623,13 @@
           <w:p>
             <w:pPr>
               <w:spacing w:after="0" w:before="0" w:line="240" w:lineRule="auto"/>
+              <w:jc w:val="left"/>
             </w:pPr>
             <w:r>
               <w:rPr>
                 <w:b w:val="0"/>
                 <w:color w:val="242424"/>
-                <w:sz w:val="18"/>
+                <w:sz w:val="19"/>
               </w:rPr>
               <w:t>Sep 23-30</w:t>
             </w:r>
@@ -1614,8 +1641,8 @@
             <w:vAlign w:val="center"/>
             <w:shd w:fill="FFFFFF"/>
             <w:tcMar>
-              <w:top w:w="65" w:type="dxa"/>
-              <w:bottom w:w="65" w:type="dxa"/>
+              <w:top w:w="85" w:type="dxa"/>
+              <w:bottom w:w="85" w:type="dxa"/>
               <w:left w:w="95" w:type="dxa"/>
               <w:right w:w="95" w:type="dxa"/>
             </w:tcMar>
@@ -1635,7 +1662,7 @@
               <w:rPr>
                 <w:b w:val="0"/>
                 <w:color w:val="242424"/>
-                <w:sz w:val="18"/>
+                <w:sz w:val="19"/>
               </w:rPr>
               <w:t>19.1%</w:t>
             </w:r>
@@ -1647,8 +1674,8 @@
             <w:vAlign w:val="center"/>
             <w:shd w:fill="FFFFFF"/>
             <w:tcMar>
-              <w:top w:w="65" w:type="dxa"/>
-              <w:bottom w:w="65" w:type="dxa"/>
+              <w:top w:w="85" w:type="dxa"/>
+              <w:bottom w:w="85" w:type="dxa"/>
               <w:left w:w="95" w:type="dxa"/>
               <w:right w:w="95" w:type="dxa"/>
             </w:tcMar>
@@ -1668,7 +1695,7 @@
               <w:rPr>
                 <w:b w:val="0"/>
                 <w:color w:val="242424"/>
-                <w:sz w:val="18"/>
+                <w:sz w:val="19"/>
               </w:rPr>
               <w:t>10.7%</w:t>
             </w:r>
@@ -1680,8 +1707,8 @@
             <w:vAlign w:val="center"/>
             <w:shd w:fill="FFFFFF"/>
             <w:tcMar>
-              <w:top w:w="65" w:type="dxa"/>
-              <w:bottom w:w="65" w:type="dxa"/>
+              <w:top w:w="85" w:type="dxa"/>
+              <w:bottom w:w="85" w:type="dxa"/>
               <w:left w:w="95" w:type="dxa"/>
               <w:right w:w="95" w:type="dxa"/>
             </w:tcMar>
@@ -1701,7 +1728,7 @@
               <w:rPr>
                 <w:b w:val="0"/>
                 <w:color w:val="242424"/>
-                <w:sz w:val="18"/>
+                <w:sz w:val="19"/>
               </w:rPr>
               <w:t>27.1%</w:t>
             </w:r>
@@ -1713,8 +1740,8 @@
             <w:vAlign w:val="center"/>
             <w:shd w:fill="FFFFFF"/>
             <w:tcMar>
-              <w:top w:w="65" w:type="dxa"/>
-              <w:bottom w:w="65" w:type="dxa"/>
+              <w:top w:w="85" w:type="dxa"/>
+              <w:bottom w:w="85" w:type="dxa"/>
               <w:left w:w="95" w:type="dxa"/>
               <w:right w:w="95" w:type="dxa"/>
             </w:tcMar>
@@ -1734,7 +1761,7 @@
               <w:rPr>
                 <w:b w:val="0"/>
                 <w:color w:val="242424"/>
-                <w:sz w:val="18"/>
+                <w:sz w:val="19"/>
               </w:rPr>
               <w:t>27.2%</w:t>
             </w:r>
@@ -1745,6 +1772,7 @@
     <w:p>
       <w:pPr>
         <w:pStyle w:val="Caption"/>
+        <w:spacing w:before="80"/>
       </w:pPr>
       <w:r>
         <w:t>Table 1. Record-weighted negative-tone shares within three fixed calendar phases.</w:t>
@@ -2018,8 +2046,8 @@
             <w:vAlign w:val="center"/>
             <w:shd w:fill="254C45"/>
             <w:tcMar>
-              <w:top w:w="65" w:type="dxa"/>
-              <w:bottom w:w="65" w:type="dxa"/>
+              <w:top w:w="85" w:type="dxa"/>
+              <w:bottom w:w="85" w:type="dxa"/>
               <w:left w:w="95" w:type="dxa"/>
               <w:right w:w="95" w:type="dxa"/>
             </w:tcMar>
@@ -2033,12 +2061,13 @@
           <w:p>
             <w:pPr>
               <w:spacing w:after="0" w:before="0" w:line="240" w:lineRule="auto"/>
+              <w:jc w:val="left"/>
             </w:pPr>
             <w:r>
               <w:rPr>
                 <w:b/>
                 <w:color w:val="FFFFFF"/>
-                <w:sz w:val="18"/>
+                <w:sz w:val="19"/>
               </w:rPr>
               <w:t>Model</w:t>
             </w:r>
@@ -2050,8 +2079,8 @@
             <w:vAlign w:val="center"/>
             <w:shd w:fill="254C45"/>
             <w:tcMar>
-              <w:top w:w="65" w:type="dxa"/>
-              <w:bottom w:w="65" w:type="dxa"/>
+              <w:top w:w="85" w:type="dxa"/>
+              <w:bottom w:w="85" w:type="dxa"/>
               <w:left w:w="95" w:type="dxa"/>
               <w:right w:w="95" w:type="dxa"/>
             </w:tcMar>
@@ -2071,7 +2100,7 @@
               <w:rPr>
                 <w:b/>
                 <w:color w:val="FFFFFF"/>
-                <w:sz w:val="18"/>
+                <w:sz w:val="19"/>
               </w:rPr>
               <w:t>Direction</w:t>
             </w:r>
@@ -2083,8 +2112,8 @@
             <w:vAlign w:val="center"/>
             <w:shd w:fill="254C45"/>
             <w:tcMar>
-              <w:top w:w="65" w:type="dxa"/>
-              <w:bottom w:w="65" w:type="dxa"/>
+              <w:top w:w="85" w:type="dxa"/>
+              <w:bottom w:w="85" w:type="dxa"/>
               <w:left w:w="95" w:type="dxa"/>
               <w:right w:w="95" w:type="dxa"/>
             </w:tcMar>
@@ -2104,7 +2133,7 @@
               <w:rPr>
                 <w:b/>
                 <w:color w:val="FFFFFF"/>
-                <w:sz w:val="18"/>
+                <w:sz w:val="19"/>
               </w:rPr>
               <w:t>F statistic</w:t>
             </w:r>
@@ -2116,8 +2145,8 @@
             <w:vAlign w:val="center"/>
             <w:shd w:fill="254C45"/>
             <w:tcMar>
-              <w:top w:w="65" w:type="dxa"/>
-              <w:bottom w:w="65" w:type="dxa"/>
+              <w:top w:w="85" w:type="dxa"/>
+              <w:bottom w:w="85" w:type="dxa"/>
               <w:left w:w="95" w:type="dxa"/>
               <w:right w:w="95" w:type="dxa"/>
             </w:tcMar>
@@ -2137,7 +2166,7 @@
               <w:rPr>
                 <w:b/>
                 <w:color w:val="FFFFFF"/>
-                <w:sz w:val="18"/>
+                <w:sz w:val="19"/>
               </w:rPr>
               <w:t>Raw p</w:t>
             </w:r>
@@ -2149,8 +2178,8 @@
             <w:vAlign w:val="center"/>
             <w:shd w:fill="254C45"/>
             <w:tcMar>
-              <w:top w:w="65" w:type="dxa"/>
-              <w:bottom w:w="65" w:type="dxa"/>
+              <w:top w:w="85" w:type="dxa"/>
+              <w:bottom w:w="85" w:type="dxa"/>
               <w:left w:w="95" w:type="dxa"/>
               <w:right w:w="95" w:type="dxa"/>
             </w:tcMar>
@@ -2170,7 +2199,7 @@
               <w:rPr>
                 <w:b/>
                 <w:color w:val="FFFFFF"/>
-                <w:sz w:val="18"/>
+                <w:sz w:val="19"/>
               </w:rPr>
               <w:t>Holm p</w:t>
             </w:r>
@@ -2187,8 +2216,8 @@
             <w:vAlign w:val="center"/>
             <w:shd w:fill="FFFFFF"/>
             <w:tcMar>
-              <w:top w:w="65" w:type="dxa"/>
-              <w:bottom w:w="65" w:type="dxa"/>
+              <w:top w:w="85" w:type="dxa"/>
+              <w:bottom w:w="85" w:type="dxa"/>
               <w:left w:w="95" w:type="dxa"/>
               <w:right w:w="95" w:type="dxa"/>
             </w:tcMar>
@@ -2202,12 +2231,13 @@
           <w:p>
             <w:pPr>
               <w:spacing w:after="0" w:before="0" w:line="240" w:lineRule="auto"/>
+              <w:jc w:val="left"/>
             </w:pPr>
             <w:r>
               <w:rPr>
                 <w:b w:val="0"/>
                 <w:color w:val="242424"/>
-                <w:sz w:val="18"/>
+                <w:sz w:val="19"/>
               </w:rPr>
               <w:t>VADER</w:t>
             </w:r>
@@ -2219,8 +2249,8 @@
             <w:vAlign w:val="center"/>
             <w:shd w:fill="FFFFFF"/>
             <w:tcMar>
-              <w:top w:w="65" w:type="dxa"/>
-              <w:bottom w:w="65" w:type="dxa"/>
+              <w:top w:w="85" w:type="dxa"/>
+              <w:bottom w:w="85" w:type="dxa"/>
               <w:left w:w="95" w:type="dxa"/>
               <w:right w:w="95" w:type="dxa"/>
             </w:tcMar>
@@ -2240,7 +2270,7 @@
               <w:rPr>
                 <w:b w:val="0"/>
                 <w:color w:val="242424"/>
-                <w:sz w:val="18"/>
+                <w:sz w:val="19"/>
               </w:rPr>
               <w:t>News → return</w:t>
             </w:r>
@@ -2252,8 +2282,8 @@
             <w:vAlign w:val="center"/>
             <w:shd w:fill="FFFFFF"/>
             <w:tcMar>
-              <w:top w:w="65" w:type="dxa"/>
-              <w:bottom w:w="65" w:type="dxa"/>
+              <w:top w:w="85" w:type="dxa"/>
+              <w:bottom w:w="85" w:type="dxa"/>
               <w:left w:w="95" w:type="dxa"/>
               <w:right w:w="95" w:type="dxa"/>
             </w:tcMar>
@@ -2273,7 +2303,7 @@
               <w:rPr>
                 <w:b w:val="0"/>
                 <w:color w:val="242424"/>
-                <w:sz w:val="18"/>
+                <w:sz w:val="19"/>
               </w:rPr>
               <w:t>0.073</w:t>
             </w:r>
@@ -2285,8 +2315,8 @@
             <w:vAlign w:val="center"/>
             <w:shd w:fill="FFFFFF"/>
             <w:tcMar>
-              <w:top w:w="65" w:type="dxa"/>
-              <w:bottom w:w="65" w:type="dxa"/>
+              <w:top w:w="85" w:type="dxa"/>
+              <w:bottom w:w="85" w:type="dxa"/>
               <w:left w:w="95" w:type="dxa"/>
               <w:right w:w="95" w:type="dxa"/>
             </w:tcMar>
@@ -2306,7 +2336,7 @@
               <w:rPr>
                 <w:b w:val="0"/>
                 <w:color w:val="242424"/>
-                <w:sz w:val="18"/>
+                <w:sz w:val="19"/>
               </w:rPr>
               <w:t>0.792</w:t>
             </w:r>
@@ -2318,8 +2348,8 @@
             <w:vAlign w:val="center"/>
             <w:shd w:fill="FFFFFF"/>
             <w:tcMar>
-              <w:top w:w="65" w:type="dxa"/>
-              <w:bottom w:w="65" w:type="dxa"/>
+              <w:top w:w="85" w:type="dxa"/>
+              <w:bottom w:w="85" w:type="dxa"/>
               <w:left w:w="95" w:type="dxa"/>
               <w:right w:w="95" w:type="dxa"/>
             </w:tcMar>
@@ -2339,7 +2369,7 @@
               <w:rPr>
                 <w:b w:val="0"/>
                 <w:color w:val="242424"/>
-                <w:sz w:val="18"/>
+                <w:sz w:val="19"/>
               </w:rPr>
               <w:t>1.000</w:t>
             </w:r>
@@ -2356,8 +2386,8 @@
             <w:vAlign w:val="center"/>
             <w:shd w:fill="F3F6F5"/>
             <w:tcMar>
-              <w:top w:w="65" w:type="dxa"/>
-              <w:bottom w:w="65" w:type="dxa"/>
+              <w:top w:w="85" w:type="dxa"/>
+              <w:bottom w:w="85" w:type="dxa"/>
               <w:left w:w="95" w:type="dxa"/>
               <w:right w:w="95" w:type="dxa"/>
             </w:tcMar>
@@ -2371,12 +2401,13 @@
           <w:p>
             <w:pPr>
               <w:spacing w:after="0" w:before="0" w:line="240" w:lineRule="auto"/>
+              <w:jc w:val="left"/>
             </w:pPr>
             <w:r>
               <w:rPr>
                 <w:b w:val="0"/>
                 <w:color w:val="242424"/>
-                <w:sz w:val="18"/>
+                <w:sz w:val="19"/>
               </w:rPr>
               <w:t>VADER</w:t>
             </w:r>
@@ -2388,8 +2419,8 @@
             <w:vAlign w:val="center"/>
             <w:shd w:fill="F3F6F5"/>
             <w:tcMar>
-              <w:top w:w="65" w:type="dxa"/>
-              <w:bottom w:w="65" w:type="dxa"/>
+              <w:top w:w="85" w:type="dxa"/>
+              <w:bottom w:w="85" w:type="dxa"/>
               <w:left w:w="95" w:type="dxa"/>
               <w:right w:w="95" w:type="dxa"/>
             </w:tcMar>
@@ -2409,7 +2440,7 @@
               <w:rPr>
                 <w:b w:val="0"/>
                 <w:color w:val="242424"/>
-                <w:sz w:val="18"/>
+                <w:sz w:val="19"/>
               </w:rPr>
               <w:t>Return → News</w:t>
             </w:r>
@@ -2421,8 +2452,8 @@
             <w:vAlign w:val="center"/>
             <w:shd w:fill="F3F6F5"/>
             <w:tcMar>
-              <w:top w:w="65" w:type="dxa"/>
-              <w:bottom w:w="65" w:type="dxa"/>
+              <w:top w:w="85" w:type="dxa"/>
+              <w:bottom w:w="85" w:type="dxa"/>
               <w:left w:w="95" w:type="dxa"/>
               <w:right w:w="95" w:type="dxa"/>
             </w:tcMar>
@@ -2442,7 +2473,7 @@
               <w:rPr>
                 <w:b w:val="0"/>
                 <w:color w:val="242424"/>
-                <w:sz w:val="18"/>
+                <w:sz w:val="19"/>
               </w:rPr>
               <w:t>1.985</w:t>
             </w:r>
@@ -2454,8 +2485,8 @@
             <w:vAlign w:val="center"/>
             <w:shd w:fill="F3F6F5"/>
             <w:tcMar>
-              <w:top w:w="65" w:type="dxa"/>
-              <w:bottom w:w="65" w:type="dxa"/>
+              <w:top w:w="85" w:type="dxa"/>
+              <w:bottom w:w="85" w:type="dxa"/>
               <w:left w:w="95" w:type="dxa"/>
               <w:right w:w="95" w:type="dxa"/>
             </w:tcMar>
@@ -2475,7 +2506,7 @@
               <w:rPr>
                 <w:b w:val="0"/>
                 <w:color w:val="242424"/>
-                <w:sz w:val="18"/>
+                <w:sz w:val="19"/>
               </w:rPr>
               <w:t>0.186</w:t>
             </w:r>
@@ -2487,8 +2518,8 @@
             <w:vAlign w:val="center"/>
             <w:shd w:fill="F3F6F5"/>
             <w:tcMar>
-              <w:top w:w="65" w:type="dxa"/>
-              <w:bottom w:w="65" w:type="dxa"/>
+              <w:top w:w="85" w:type="dxa"/>
+              <w:bottom w:w="85" w:type="dxa"/>
               <w:left w:w="95" w:type="dxa"/>
               <w:right w:w="95" w:type="dxa"/>
             </w:tcMar>
@@ -2508,7 +2539,7 @@
               <w:rPr>
                 <w:b w:val="0"/>
                 <w:color w:val="242424"/>
-                <w:sz w:val="18"/>
+                <w:sz w:val="19"/>
               </w:rPr>
               <w:t>1.000</w:t>
             </w:r>
@@ -2525,8 +2556,8 @@
             <w:vAlign w:val="center"/>
             <w:shd w:fill="FFFFFF"/>
             <w:tcMar>
-              <w:top w:w="65" w:type="dxa"/>
-              <w:bottom w:w="65" w:type="dxa"/>
+              <w:top w:w="85" w:type="dxa"/>
+              <w:bottom w:w="85" w:type="dxa"/>
               <w:left w:w="95" w:type="dxa"/>
               <w:right w:w="95" w:type="dxa"/>
             </w:tcMar>
@@ -2540,12 +2571,13 @@
           <w:p>
             <w:pPr>
               <w:spacing w:after="0" w:before="0" w:line="240" w:lineRule="auto"/>
+              <w:jc w:val="left"/>
             </w:pPr>
             <w:r>
               <w:rPr>
                 <w:b w:val="0"/>
                 <w:color w:val="242424"/>
-                <w:sz w:val="18"/>
+                <w:sz w:val="19"/>
               </w:rPr>
               <w:t>VADER</w:t>
             </w:r>
@@ -2557,8 +2589,8 @@
             <w:vAlign w:val="center"/>
             <w:shd w:fill="FFFFFF"/>
             <w:tcMar>
-              <w:top w:w="65" w:type="dxa"/>
-              <w:bottom w:w="65" w:type="dxa"/>
+              <w:top w:w="85" w:type="dxa"/>
+              <w:bottom w:w="85" w:type="dxa"/>
               <w:left w:w="95" w:type="dxa"/>
               <w:right w:w="95" w:type="dxa"/>
             </w:tcMar>
@@ -2578,7 +2610,7 @@
               <w:rPr>
                 <w:b w:val="0"/>
                 <w:color w:val="242424"/>
-                <w:sz w:val="18"/>
+                <w:sz w:val="19"/>
               </w:rPr>
               <w:t>X → return</w:t>
             </w:r>
@@ -2590,8 +2622,8 @@
             <w:vAlign w:val="center"/>
             <w:shd w:fill="FFFFFF"/>
             <w:tcMar>
-              <w:top w:w="65" w:type="dxa"/>
-              <w:bottom w:w="65" w:type="dxa"/>
+              <w:top w:w="85" w:type="dxa"/>
+              <w:bottom w:w="85" w:type="dxa"/>
               <w:left w:w="95" w:type="dxa"/>
               <w:right w:w="95" w:type="dxa"/>
             </w:tcMar>
@@ -2611,7 +2643,7 @@
               <w:rPr>
                 <w:b w:val="0"/>
                 <w:color w:val="242424"/>
-                <w:sz w:val="18"/>
+                <w:sz w:val="19"/>
               </w:rPr>
               <w:t>0.057</w:t>
             </w:r>
@@ -2623,8 +2655,8 @@
             <w:vAlign w:val="center"/>
             <w:shd w:fill="FFFFFF"/>
             <w:tcMar>
-              <w:top w:w="65" w:type="dxa"/>
-              <w:bottom w:w="65" w:type="dxa"/>
+              <w:top w:w="85" w:type="dxa"/>
+              <w:bottom w:w="85" w:type="dxa"/>
               <w:left w:w="95" w:type="dxa"/>
               <w:right w:w="95" w:type="dxa"/>
             </w:tcMar>
@@ -2644,7 +2676,7 @@
               <w:rPr>
                 <w:b w:val="0"/>
                 <w:color w:val="242424"/>
-                <w:sz w:val="18"/>
+                <w:sz w:val="19"/>
               </w:rPr>
               <w:t>0.816</w:t>
             </w:r>
@@ -2656,8 +2688,8 @@
             <w:vAlign w:val="center"/>
             <w:shd w:fill="FFFFFF"/>
             <w:tcMar>
-              <w:top w:w="65" w:type="dxa"/>
-              <w:bottom w:w="65" w:type="dxa"/>
+              <w:top w:w="85" w:type="dxa"/>
+              <w:bottom w:w="85" w:type="dxa"/>
               <w:left w:w="95" w:type="dxa"/>
               <w:right w:w="95" w:type="dxa"/>
             </w:tcMar>
@@ -2677,7 +2709,7 @@
               <w:rPr>
                 <w:b w:val="0"/>
                 <w:color w:val="242424"/>
-                <w:sz w:val="18"/>
+                <w:sz w:val="19"/>
               </w:rPr>
               <w:t>1.000</w:t>
             </w:r>
@@ -2694,8 +2726,8 @@
             <w:vAlign w:val="center"/>
             <w:shd w:fill="F3F6F5"/>
             <w:tcMar>
-              <w:top w:w="65" w:type="dxa"/>
-              <w:bottom w:w="65" w:type="dxa"/>
+              <w:top w:w="85" w:type="dxa"/>
+              <w:bottom w:w="85" w:type="dxa"/>
               <w:left w:w="95" w:type="dxa"/>
               <w:right w:w="95" w:type="dxa"/>
             </w:tcMar>
@@ -2709,12 +2741,13 @@
           <w:p>
             <w:pPr>
               <w:spacing w:after="0" w:before="0" w:line="240" w:lineRule="auto"/>
+              <w:jc w:val="left"/>
             </w:pPr>
             <w:r>
               <w:rPr>
                 <w:b w:val="0"/>
                 <w:color w:val="242424"/>
-                <w:sz w:val="18"/>
+                <w:sz w:val="19"/>
               </w:rPr>
               <w:t>VADER</w:t>
             </w:r>
@@ -2726,8 +2759,8 @@
             <w:vAlign w:val="center"/>
             <w:shd w:fill="F3F6F5"/>
             <w:tcMar>
-              <w:top w:w="65" w:type="dxa"/>
-              <w:bottom w:w="65" w:type="dxa"/>
+              <w:top w:w="85" w:type="dxa"/>
+              <w:bottom w:w="85" w:type="dxa"/>
               <w:left w:w="95" w:type="dxa"/>
               <w:right w:w="95" w:type="dxa"/>
             </w:tcMar>
@@ -2747,7 +2780,7 @@
               <w:rPr>
                 <w:b w:val="0"/>
                 <w:color w:val="242424"/>
-                <w:sz w:val="18"/>
+                <w:sz w:val="19"/>
               </w:rPr>
               <w:t>Return → X</w:t>
             </w:r>
@@ -2759,8 +2792,8 @@
             <w:vAlign w:val="center"/>
             <w:shd w:fill="F3F6F5"/>
             <w:tcMar>
-              <w:top w:w="65" w:type="dxa"/>
-              <w:bottom w:w="65" w:type="dxa"/>
+              <w:top w:w="85" w:type="dxa"/>
+              <w:bottom w:w="85" w:type="dxa"/>
               <w:left w:w="95" w:type="dxa"/>
               <w:right w:w="95" w:type="dxa"/>
             </w:tcMar>
@@ -2780,7 +2813,7 @@
               <w:rPr>
                 <w:b w:val="0"/>
                 <w:color w:val="242424"/>
-                <w:sz w:val="18"/>
+                <w:sz w:val="19"/>
               </w:rPr>
               <w:t>2.061</w:t>
             </w:r>
@@ -2792,8 +2825,8 @@
             <w:vAlign w:val="center"/>
             <w:shd w:fill="F3F6F5"/>
             <w:tcMar>
-              <w:top w:w="65" w:type="dxa"/>
-              <w:bottom w:w="65" w:type="dxa"/>
+              <w:top w:w="85" w:type="dxa"/>
+              <w:bottom w:w="85" w:type="dxa"/>
               <w:left w:w="95" w:type="dxa"/>
               <w:right w:w="95" w:type="dxa"/>
             </w:tcMar>
@@ -2813,7 +2846,7 @@
               <w:rPr>
                 <w:b w:val="0"/>
                 <w:color w:val="242424"/>
-                <w:sz w:val="18"/>
+                <w:sz w:val="19"/>
               </w:rPr>
               <w:t>0.179</w:t>
             </w:r>
@@ -2825,8 +2858,8 @@
             <w:vAlign w:val="center"/>
             <w:shd w:fill="F3F6F5"/>
             <w:tcMar>
-              <w:top w:w="65" w:type="dxa"/>
-              <w:bottom w:w="65" w:type="dxa"/>
+              <w:top w:w="85" w:type="dxa"/>
+              <w:bottom w:w="85" w:type="dxa"/>
               <w:left w:w="95" w:type="dxa"/>
               <w:right w:w="95" w:type="dxa"/>
             </w:tcMar>
@@ -2846,7 +2879,7 @@
               <w:rPr>
                 <w:b w:val="0"/>
                 <w:color w:val="242424"/>
-                <w:sz w:val="18"/>
+                <w:sz w:val="19"/>
               </w:rPr>
               <w:t>1.000</w:t>
             </w:r>
@@ -2863,8 +2896,8 @@
             <w:vAlign w:val="center"/>
             <w:shd w:fill="FFFFFF"/>
             <w:tcMar>
-              <w:top w:w="65" w:type="dxa"/>
-              <w:bottom w:w="65" w:type="dxa"/>
+              <w:top w:w="85" w:type="dxa"/>
+              <w:bottom w:w="85" w:type="dxa"/>
               <w:left w:w="95" w:type="dxa"/>
               <w:right w:w="95" w:type="dxa"/>
             </w:tcMar>
@@ -2878,12 +2911,13 @@
           <w:p>
             <w:pPr>
               <w:spacing w:after="0" w:before="0" w:line="240" w:lineRule="auto"/>
+              <w:jc w:val="left"/>
             </w:pPr>
             <w:r>
               <w:rPr>
                 <w:b w:val="0"/>
                 <w:color w:val="242424"/>
-                <w:sz w:val="18"/>
+                <w:sz w:val="19"/>
               </w:rPr>
               <w:t>RoBERTa</w:t>
             </w:r>
@@ -2895,8 +2929,8 @@
             <w:vAlign w:val="center"/>
             <w:shd w:fill="FFFFFF"/>
             <w:tcMar>
-              <w:top w:w="65" w:type="dxa"/>
-              <w:bottom w:w="65" w:type="dxa"/>
+              <w:top w:w="85" w:type="dxa"/>
+              <w:bottom w:w="85" w:type="dxa"/>
               <w:left w:w="95" w:type="dxa"/>
               <w:right w:w="95" w:type="dxa"/>
             </w:tcMar>
@@ -2916,7 +2950,7 @@
               <w:rPr>
                 <w:b w:val="0"/>
                 <w:color w:val="242424"/>
-                <w:sz w:val="18"/>
+                <w:sz w:val="19"/>
               </w:rPr>
               <w:t>News → return</w:t>
             </w:r>
@@ -2928,8 +2962,8 @@
             <w:vAlign w:val="center"/>
             <w:shd w:fill="FFFFFF"/>
             <w:tcMar>
-              <w:top w:w="65" w:type="dxa"/>
-              <w:bottom w:w="65" w:type="dxa"/>
+              <w:top w:w="85" w:type="dxa"/>
+              <w:bottom w:w="85" w:type="dxa"/>
               <w:left w:w="95" w:type="dxa"/>
               <w:right w:w="95" w:type="dxa"/>
             </w:tcMar>
@@ -2949,7 +2983,7 @@
               <w:rPr>
                 <w:b w:val="0"/>
                 <w:color w:val="242424"/>
-                <w:sz w:val="18"/>
+                <w:sz w:val="19"/>
               </w:rPr>
               <w:t>0.127</w:t>
             </w:r>
@@ -2961,8 +2995,8 @@
             <w:vAlign w:val="center"/>
             <w:shd w:fill="FFFFFF"/>
             <w:tcMar>
-              <w:top w:w="65" w:type="dxa"/>
-              <w:bottom w:w="65" w:type="dxa"/>
+              <w:top w:w="85" w:type="dxa"/>
+              <w:bottom w:w="85" w:type="dxa"/>
               <w:left w:w="95" w:type="dxa"/>
               <w:right w:w="95" w:type="dxa"/>
             </w:tcMar>
@@ -2982,7 +3016,7 @@
               <w:rPr>
                 <w:b w:val="0"/>
                 <w:color w:val="242424"/>
-                <w:sz w:val="18"/>
+                <w:sz w:val="19"/>
               </w:rPr>
               <w:t>0.728</w:t>
             </w:r>
@@ -2994,8 +3028,8 @@
             <w:vAlign w:val="center"/>
             <w:shd w:fill="FFFFFF"/>
             <w:tcMar>
-              <w:top w:w="65" w:type="dxa"/>
-              <w:bottom w:w="65" w:type="dxa"/>
+              <w:top w:w="85" w:type="dxa"/>
+              <w:bottom w:w="85" w:type="dxa"/>
               <w:left w:w="95" w:type="dxa"/>
               <w:right w:w="95" w:type="dxa"/>
             </w:tcMar>
@@ -3015,7 +3049,7 @@
               <w:rPr>
                 <w:b w:val="0"/>
                 <w:color w:val="242424"/>
-                <w:sz w:val="18"/>
+                <w:sz w:val="19"/>
               </w:rPr>
               <w:t>1.000</w:t>
             </w:r>
@@ -3032,8 +3066,8 @@
             <w:vAlign w:val="center"/>
             <w:shd w:fill="F3F6F5"/>
             <w:tcMar>
-              <w:top w:w="65" w:type="dxa"/>
-              <w:bottom w:w="65" w:type="dxa"/>
+              <w:top w:w="85" w:type="dxa"/>
+              <w:bottom w:w="85" w:type="dxa"/>
               <w:left w:w="95" w:type="dxa"/>
               <w:right w:w="95" w:type="dxa"/>
             </w:tcMar>
@@ -3047,12 +3081,13 @@
           <w:p>
             <w:pPr>
               <w:spacing w:after="0" w:before="0" w:line="240" w:lineRule="auto"/>
+              <w:jc w:val="left"/>
             </w:pPr>
             <w:r>
               <w:rPr>
                 <w:b w:val="0"/>
                 <w:color w:val="242424"/>
-                <w:sz w:val="18"/>
+                <w:sz w:val="19"/>
               </w:rPr>
               <w:t>RoBERTa</w:t>
             </w:r>
@@ -3064,8 +3099,8 @@
             <w:vAlign w:val="center"/>
             <w:shd w:fill="F3F6F5"/>
             <w:tcMar>
-              <w:top w:w="65" w:type="dxa"/>
-              <w:bottom w:w="65" w:type="dxa"/>
+              <w:top w:w="85" w:type="dxa"/>
+              <w:bottom w:w="85" w:type="dxa"/>
               <w:left w:w="95" w:type="dxa"/>
               <w:right w:w="95" w:type="dxa"/>
             </w:tcMar>
@@ -3085,7 +3120,7 @@
               <w:rPr>
                 <w:b w:val="0"/>
                 <w:color w:val="242424"/>
-                <w:sz w:val="18"/>
+                <w:sz w:val="19"/>
               </w:rPr>
               <w:t>Return → News</w:t>
             </w:r>
@@ -3097,8 +3132,8 @@
             <w:vAlign w:val="center"/>
             <w:shd w:fill="F3F6F5"/>
             <w:tcMar>
-              <w:top w:w="65" w:type="dxa"/>
-              <w:bottom w:w="65" w:type="dxa"/>
+              <w:top w:w="85" w:type="dxa"/>
+              <w:bottom w:w="85" w:type="dxa"/>
               <w:left w:w="95" w:type="dxa"/>
               <w:right w:w="95" w:type="dxa"/>
             </w:tcMar>
@@ -3118,7 +3153,7 @@
               <w:rPr>
                 <w:b w:val="0"/>
                 <w:color w:val="242424"/>
-                <w:sz w:val="18"/>
+                <w:sz w:val="19"/>
               </w:rPr>
               <w:t>0.843</w:t>
             </w:r>
@@ -3130,8 +3165,8 @@
             <w:vAlign w:val="center"/>
             <w:shd w:fill="F3F6F5"/>
             <w:tcMar>
-              <w:top w:w="65" w:type="dxa"/>
-              <w:bottom w:w="65" w:type="dxa"/>
+              <w:top w:w="85" w:type="dxa"/>
+              <w:bottom w:w="85" w:type="dxa"/>
               <w:left w:w="95" w:type="dxa"/>
               <w:right w:w="95" w:type="dxa"/>
             </w:tcMar>
@@ -3151,7 +3186,7 @@
               <w:rPr>
                 <w:b w:val="0"/>
                 <w:color w:val="242424"/>
-                <w:sz w:val="18"/>
+                <w:sz w:val="19"/>
               </w:rPr>
               <w:t>0.378</w:t>
             </w:r>
@@ -3163,8 +3198,8 @@
             <w:vAlign w:val="center"/>
             <w:shd w:fill="F3F6F5"/>
             <w:tcMar>
-              <w:top w:w="65" w:type="dxa"/>
-              <w:bottom w:w="65" w:type="dxa"/>
+              <w:top w:w="85" w:type="dxa"/>
+              <w:bottom w:w="85" w:type="dxa"/>
               <w:left w:w="95" w:type="dxa"/>
               <w:right w:w="95" w:type="dxa"/>
             </w:tcMar>
@@ -3184,7 +3219,7 @@
               <w:rPr>
                 <w:b w:val="0"/>
                 <w:color w:val="242424"/>
-                <w:sz w:val="18"/>
+                <w:sz w:val="19"/>
               </w:rPr>
               <w:t>1.000</w:t>
             </w:r>
@@ -3201,8 +3236,8 @@
             <w:vAlign w:val="center"/>
             <w:shd w:fill="FFFFFF"/>
             <w:tcMar>
-              <w:top w:w="65" w:type="dxa"/>
-              <w:bottom w:w="65" w:type="dxa"/>
+              <w:top w:w="85" w:type="dxa"/>
+              <w:bottom w:w="85" w:type="dxa"/>
               <w:left w:w="95" w:type="dxa"/>
               <w:right w:w="95" w:type="dxa"/>
             </w:tcMar>
@@ -3216,12 +3251,13 @@
           <w:p>
             <w:pPr>
               <w:spacing w:after="0" w:before="0" w:line="240" w:lineRule="auto"/>
+              <w:jc w:val="left"/>
             </w:pPr>
             <w:r>
               <w:rPr>
                 <w:b w:val="0"/>
                 <w:color w:val="242424"/>
-                <w:sz w:val="18"/>
+                <w:sz w:val="19"/>
               </w:rPr>
               <w:t>RoBERTa</w:t>
             </w:r>
@@ -3233,8 +3269,8 @@
             <w:vAlign w:val="center"/>
             <w:shd w:fill="FFFFFF"/>
             <w:tcMar>
-              <w:top w:w="65" w:type="dxa"/>
-              <w:bottom w:w="65" w:type="dxa"/>
+              <w:top w:w="85" w:type="dxa"/>
+              <w:bottom w:w="85" w:type="dxa"/>
               <w:left w:w="95" w:type="dxa"/>
               <w:right w:w="95" w:type="dxa"/>
             </w:tcMar>
@@ -3254,7 +3290,7 @@
               <w:rPr>
                 <w:b w:val="0"/>
                 <w:color w:val="242424"/>
-                <w:sz w:val="18"/>
+                <w:sz w:val="19"/>
               </w:rPr>
               <w:t>X → return</w:t>
             </w:r>
@@ -3266,8 +3302,8 @@
             <w:vAlign w:val="center"/>
             <w:shd w:fill="FFFFFF"/>
             <w:tcMar>
-              <w:top w:w="65" w:type="dxa"/>
-              <w:bottom w:w="65" w:type="dxa"/>
+              <w:top w:w="85" w:type="dxa"/>
+              <w:bottom w:w="85" w:type="dxa"/>
               <w:left w:w="95" w:type="dxa"/>
               <w:right w:w="95" w:type="dxa"/>
             </w:tcMar>
@@ -3287,7 +3323,7 @@
               <w:rPr>
                 <w:b w:val="0"/>
                 <w:color w:val="242424"/>
-                <w:sz w:val="18"/>
+                <w:sz w:val="19"/>
               </w:rPr>
               <w:t>0.588</w:t>
             </w:r>
@@ -3299,8 +3335,8 @@
             <w:vAlign w:val="center"/>
             <w:shd w:fill="FFFFFF"/>
             <w:tcMar>
-              <w:top w:w="65" w:type="dxa"/>
-              <w:bottom w:w="65" w:type="dxa"/>
+              <w:top w:w="85" w:type="dxa"/>
+              <w:bottom w:w="85" w:type="dxa"/>
               <w:left w:w="95" w:type="dxa"/>
               <w:right w:w="95" w:type="dxa"/>
             </w:tcMar>
@@ -3320,7 +3356,7 @@
               <w:rPr>
                 <w:b w:val="0"/>
                 <w:color w:val="242424"/>
-                <w:sz w:val="18"/>
+                <w:sz w:val="19"/>
               </w:rPr>
               <w:t>0.459</w:t>
             </w:r>
@@ -3332,8 +3368,8 @@
             <w:vAlign w:val="center"/>
             <w:shd w:fill="FFFFFF"/>
             <w:tcMar>
-              <w:top w:w="65" w:type="dxa"/>
-              <w:bottom w:w="65" w:type="dxa"/>
+              <w:top w:w="85" w:type="dxa"/>
+              <w:bottom w:w="85" w:type="dxa"/>
               <w:left w:w="95" w:type="dxa"/>
               <w:right w:w="95" w:type="dxa"/>
             </w:tcMar>
@@ -3353,7 +3389,7 @@
               <w:rPr>
                 <w:b w:val="0"/>
                 <w:color w:val="242424"/>
-                <w:sz w:val="18"/>
+                <w:sz w:val="19"/>
               </w:rPr>
               <w:t>1.000</w:t>
             </w:r>
@@ -3370,8 +3406,8 @@
             <w:vAlign w:val="center"/>
             <w:shd w:fill="F3F6F5"/>
             <w:tcMar>
-              <w:top w:w="65" w:type="dxa"/>
-              <w:bottom w:w="65" w:type="dxa"/>
+              <w:top w:w="85" w:type="dxa"/>
+              <w:bottom w:w="85" w:type="dxa"/>
               <w:left w:w="95" w:type="dxa"/>
               <w:right w:w="95" w:type="dxa"/>
             </w:tcMar>
@@ -3385,12 +3421,13 @@
           <w:p>
             <w:pPr>
               <w:spacing w:after="0" w:before="0" w:line="240" w:lineRule="auto"/>
+              <w:jc w:val="left"/>
             </w:pPr>
             <w:r>
               <w:rPr>
                 <w:b w:val="0"/>
                 <w:color w:val="242424"/>
-                <w:sz w:val="18"/>
+                <w:sz w:val="19"/>
               </w:rPr>
               <w:t>RoBERTa</w:t>
             </w:r>
@@ -3402,8 +3439,8 @@
             <w:vAlign w:val="center"/>
             <w:shd w:fill="F3F6F5"/>
             <w:tcMar>
-              <w:top w:w="65" w:type="dxa"/>
-              <w:bottom w:w="65" w:type="dxa"/>
+              <w:top w:w="85" w:type="dxa"/>
+              <w:bottom w:w="85" w:type="dxa"/>
               <w:left w:w="95" w:type="dxa"/>
               <w:right w:w="95" w:type="dxa"/>
             </w:tcMar>
@@ -3423,7 +3460,7 @@
               <w:rPr>
                 <w:b w:val="0"/>
                 <w:color w:val="242424"/>
-                <w:sz w:val="18"/>
+                <w:sz w:val="19"/>
               </w:rPr>
               <w:t>Return → X</w:t>
             </w:r>
@@ -3435,8 +3472,8 @@
             <w:vAlign w:val="center"/>
             <w:shd w:fill="F3F6F5"/>
             <w:tcMar>
-              <w:top w:w="65" w:type="dxa"/>
-              <w:bottom w:w="65" w:type="dxa"/>
+              <w:top w:w="85" w:type="dxa"/>
+              <w:bottom w:w="85" w:type="dxa"/>
               <w:left w:w="95" w:type="dxa"/>
               <w:right w:w="95" w:type="dxa"/>
             </w:tcMar>
@@ -3456,7 +3493,7 @@
               <w:rPr>
                 <w:b w:val="0"/>
                 <w:color w:val="242424"/>
-                <w:sz w:val="18"/>
+                <w:sz w:val="19"/>
               </w:rPr>
               <w:t>0.143</w:t>
             </w:r>
@@ -3468,8 +3505,8 @@
             <w:vAlign w:val="center"/>
             <w:shd w:fill="F3F6F5"/>
             <w:tcMar>
-              <w:top w:w="65" w:type="dxa"/>
-              <w:bottom w:w="65" w:type="dxa"/>
+              <w:top w:w="85" w:type="dxa"/>
+              <w:bottom w:w="85" w:type="dxa"/>
               <w:left w:w="95" w:type="dxa"/>
               <w:right w:w="95" w:type="dxa"/>
             </w:tcMar>
@@ -3489,7 +3526,7 @@
               <w:rPr>
                 <w:b w:val="0"/>
                 <w:color w:val="242424"/>
-                <w:sz w:val="18"/>
+                <w:sz w:val="19"/>
               </w:rPr>
               <w:t>0.713</w:t>
             </w:r>
@@ -3501,8 +3538,8 @@
             <w:vAlign w:val="center"/>
             <w:shd w:fill="F3F6F5"/>
             <w:tcMar>
-              <w:top w:w="65" w:type="dxa"/>
-              <w:bottom w:w="65" w:type="dxa"/>
+              <w:top w:w="85" w:type="dxa"/>
+              <w:bottom w:w="85" w:type="dxa"/>
               <w:left w:w="95" w:type="dxa"/>
               <w:right w:w="95" w:type="dxa"/>
             </w:tcMar>
@@ -3522,7 +3559,7 @@
               <w:rPr>
                 <w:b w:val="0"/>
                 <w:color w:val="242424"/>
-                <w:sz w:val="18"/>
+                <w:sz w:val="19"/>
               </w:rPr>
               <w:t>1.000</w:t>
             </w:r>
@@ -3533,6 +3570,7 @@
     <w:p>
       <w:pPr>
         <w:pStyle w:val="Caption"/>
+        <w:spacing w:before="80"/>
       </w:pPr>
       <w:r>
         <w:t>Table 2. One-lag Granger tests. Holm p values correct the eight displayed tests across both models. Every regression uses the same fixed period; no lag is selected for its p value.</w:t>
@@ -3646,8 +3684,8 @@
             <w:vAlign w:val="center"/>
             <w:shd w:fill="254C45"/>
             <w:tcMar>
-              <w:top w:w="65" w:type="dxa"/>
-              <w:bottom w:w="65" w:type="dxa"/>
+              <w:top w:w="85" w:type="dxa"/>
+              <w:bottom w:w="85" w:type="dxa"/>
               <w:left w:w="95" w:type="dxa"/>
               <w:right w:w="95" w:type="dxa"/>
             </w:tcMar>
@@ -3661,12 +3699,13 @@
           <w:p>
             <w:pPr>
               <w:spacing w:after="0" w:before="0" w:line="240" w:lineRule="auto"/>
+              <w:jc w:val="left"/>
             </w:pPr>
             <w:r>
               <w:rPr>
                 <w:b/>
                 <w:color w:val="FFFFFF"/>
-                <w:sz w:val="18"/>
+                <w:sz w:val="19"/>
               </w:rPr>
               <w:t>Comparison</w:t>
             </w:r>
@@ -3678,8 +3717,8 @@
             <w:vAlign w:val="center"/>
             <w:shd w:fill="254C45"/>
             <w:tcMar>
-              <w:top w:w="65" w:type="dxa"/>
-              <w:bottom w:w="65" w:type="dxa"/>
+              <w:top w:w="85" w:type="dxa"/>
+              <w:bottom w:w="85" w:type="dxa"/>
               <w:left w:w="95" w:type="dxa"/>
               <w:right w:w="95" w:type="dxa"/>
             </w:tcMar>
@@ -3699,7 +3738,7 @@
               <w:rPr>
                 <w:b/>
                 <w:color w:val="FFFFFF"/>
-                <w:sz w:val="18"/>
+                <w:sz w:val="19"/>
               </w:rPr>
               <w:t>VADER adjusted gap</w:t>
             </w:r>
@@ -3711,8 +3750,8 @@
             <w:vAlign w:val="center"/>
             <w:shd w:fill="254C45"/>
             <w:tcMar>
-              <w:top w:w="65" w:type="dxa"/>
-              <w:bottom w:w="65" w:type="dxa"/>
+              <w:top w:w="85" w:type="dxa"/>
+              <w:bottom w:w="85" w:type="dxa"/>
               <w:left w:w="95" w:type="dxa"/>
               <w:right w:w="95" w:type="dxa"/>
             </w:tcMar>
@@ -3726,12 +3765,13 @@
           <w:p>
             <w:pPr>
               <w:spacing w:after="0" w:before="0" w:line="240" w:lineRule="auto"/>
+              <w:jc w:val="center"/>
             </w:pPr>
             <w:r>
               <w:rPr>
                 <w:b/>
                 <w:color w:val="FFFFFF"/>
-                <w:sz w:val="18"/>
+                <w:sz w:val="19"/>
               </w:rPr>
               <w:t>RoBERTa adjusted gap</w:t>
             </w:r>
@@ -3748,8 +3788,8 @@
             <w:vAlign w:val="center"/>
             <w:shd w:fill="FFFFFF"/>
             <w:tcMar>
-              <w:top w:w="65" w:type="dxa"/>
-              <w:bottom w:w="65" w:type="dxa"/>
+              <w:top w:w="85" w:type="dxa"/>
+              <w:bottom w:w="85" w:type="dxa"/>
               <w:left w:w="95" w:type="dxa"/>
               <w:right w:w="95" w:type="dxa"/>
             </w:tcMar>
@@ -3763,12 +3803,13 @@
           <w:p>
             <w:pPr>
               <w:spacing w:after="0" w:before="0" w:line="240" w:lineRule="auto"/>
+              <w:jc w:val="left"/>
             </w:pPr>
             <w:r>
               <w:rPr>
                 <w:b w:val="0"/>
                 <w:color w:val="242424"/>
-                <w:sz w:val="18"/>
+                <w:sz w:val="19"/>
               </w:rPr>
               <w:t>US major vs corporate</w:t>
             </w:r>
@@ -3780,40 +3821,8 @@
             <w:vAlign w:val="center"/>
             <w:shd w:fill="FFFFFF"/>
             <w:tcMar>
-              <w:top w:w="65" w:type="dxa"/>
-              <w:bottom w:w="65" w:type="dxa"/>
-              <w:left w:w="95" w:type="dxa"/>
-              <w:right w:w="95" w:type="dxa"/>
-            </w:tcMar>
-            <w:tcBorders>
-              <w:top w:val="single" w:sz="4" w:color="D9D9D9"/>
-              <w:left w:val="single" w:sz="4" w:color="D9D9D9"/>
-              <w:bottom w:val="single" w:sz="4" w:color="D9D9D9"/>
-              <w:right w:val="single" w:sz="4" w:color="D9D9D9"/>
-            </w:tcBorders>
-          </w:tcPr>
-          <w:p>
-            <w:pPr>
-              <w:spacing w:after="0" w:before="0" w:line="240" w:lineRule="auto"/>
-            </w:pPr>
-            <w:r>
-              <w:rPr>
-                <w:b w:val="0"/>
-                <w:color w:val="242424"/>
-                <w:sz w:val="18"/>
-              </w:rPr>
-              <w:t>+17.1 pp [9.5, 24.6]</w:t>
-            </w:r>
-          </w:p>
-        </w:tc>
-        <w:tc>
-          <w:tcPr>
-            <w:tcW w:type="dxa" w:w="3600"/>
-            <w:vAlign w:val="center"/>
-            <w:shd w:fill="FFFFFF"/>
-            <w:tcMar>
-              <w:top w:w="65" w:type="dxa"/>
-              <w:bottom w:w="65" w:type="dxa"/>
+              <w:top w:w="85" w:type="dxa"/>
+              <w:bottom w:w="85" w:type="dxa"/>
               <w:left w:w="95" w:type="dxa"/>
               <w:right w:w="95" w:type="dxa"/>
             </w:tcMar>
@@ -3833,179 +3842,9 @@
               <w:rPr>
                 <w:b w:val="0"/>
                 <w:color w:val="242424"/>
-                <w:sz w:val="18"/>
+                <w:sz w:val="19"/>
               </w:rPr>
-              <w:t>+7.4 pp [2.4, 12.5]</w:t>
-            </w:r>
-          </w:p>
-        </w:tc>
-      </w:tr>
-      <w:tr>
-        <w:trPr>
-          <w:cantSplit/>
-        </w:trPr>
-        <w:tc>
-          <w:tcPr>
-            <w:tcW w:type="dxa" w:w="3096"/>
-            <w:vAlign w:val="center"/>
-            <w:shd w:fill="F3F6F5"/>
-            <w:tcMar>
-              <w:top w:w="65" w:type="dxa"/>
-              <w:bottom w:w="65" w:type="dxa"/>
-              <w:left w:w="95" w:type="dxa"/>
-              <w:right w:w="95" w:type="dxa"/>
-            </w:tcMar>
-            <w:tcBorders>
-              <w:top w:val="single" w:sz="4" w:color="D9D9D9"/>
-              <w:left w:val="single" w:sz="4" w:color="D9D9D9"/>
-              <w:bottom w:val="single" w:sz="4" w:color="D9D9D9"/>
-              <w:right w:val="single" w:sz="4" w:color="D9D9D9"/>
-            </w:tcBorders>
-          </w:tcPr>
-          <w:p>
-            <w:pPr>
-              <w:spacing w:after="0" w:before="0" w:line="240" w:lineRule="auto"/>
-            </w:pPr>
-            <w:r>
-              <w:rPr>
-                <w:b w:val="0"/>
-                <w:color w:val="242424"/>
-                <w:sz w:val="18"/>
-              </w:rPr>
-              <w:t>Technology vs corporate</w:t>
-            </w:r>
-          </w:p>
-        </w:tc>
-        <w:tc>
-          <w:tcPr>
-            <w:tcW w:type="dxa" w:w="3528"/>
-            <w:vAlign w:val="center"/>
-            <w:shd w:fill="F3F6F5"/>
-            <w:tcMar>
-              <w:top w:w="65" w:type="dxa"/>
-              <w:bottom w:w="65" w:type="dxa"/>
-              <w:left w:w="95" w:type="dxa"/>
-              <w:right w:w="95" w:type="dxa"/>
-            </w:tcMar>
-            <w:tcBorders>
-              <w:top w:val="single" w:sz="4" w:color="D9D9D9"/>
-              <w:left w:val="single" w:sz="4" w:color="D9D9D9"/>
-              <w:bottom w:val="single" w:sz="4" w:color="D9D9D9"/>
-              <w:right w:val="single" w:sz="4" w:color="D9D9D9"/>
-            </w:tcBorders>
-          </w:tcPr>
-          <w:p>
-            <w:pPr>
-              <w:spacing w:after="0" w:before="0" w:line="240" w:lineRule="auto"/>
-            </w:pPr>
-            <w:r>
-              <w:rPr>
-                <w:b w:val="0"/>
-                <w:color w:val="242424"/>
-                <w:sz w:val="18"/>
-              </w:rPr>
-              <w:t>+13.4 pp [7.5, 19.3]</w:t>
-            </w:r>
-          </w:p>
-        </w:tc>
-        <w:tc>
-          <w:tcPr>
-            <w:tcW w:type="dxa" w:w="3600"/>
-            <w:vAlign w:val="center"/>
-            <w:shd w:fill="F3F6F5"/>
-            <w:tcMar>
-              <w:top w:w="65" w:type="dxa"/>
-              <w:bottom w:w="65" w:type="dxa"/>
-              <w:left w:w="95" w:type="dxa"/>
-              <w:right w:w="95" w:type="dxa"/>
-            </w:tcMar>
-            <w:tcBorders>
-              <w:top w:val="single" w:sz="4" w:color="D9D9D9"/>
-              <w:left w:val="single" w:sz="4" w:color="D9D9D9"/>
-              <w:bottom w:val="single" w:sz="4" w:color="D9D9D9"/>
-              <w:right w:val="single" w:sz="4" w:color="D9D9D9"/>
-            </w:tcBorders>
-          </w:tcPr>
-          <w:p>
-            <w:pPr>
-              <w:spacing w:after="0" w:before="0" w:line="240" w:lineRule="auto"/>
-            </w:pPr>
-            <w:r>
-              <w:rPr>
-                <w:b w:val="0"/>
-                <w:color w:val="242424"/>
-                <w:sz w:val="18"/>
-              </w:rPr>
-              <w:t>+12.1 pp [6.6, 17.7]</w:t>
-            </w:r>
-          </w:p>
-        </w:tc>
-      </w:tr>
-      <w:tr>
-        <w:trPr>
-          <w:cantSplit/>
-        </w:trPr>
-        <w:tc>
-          <w:tcPr>
-            <w:tcW w:type="dxa" w:w="3096"/>
-            <w:vAlign w:val="center"/>
-            <w:shd w:fill="FFFFFF"/>
-            <w:tcMar>
-              <w:top w:w="65" w:type="dxa"/>
-              <w:bottom w:w="65" w:type="dxa"/>
-              <w:left w:w="95" w:type="dxa"/>
-              <w:right w:w="95" w:type="dxa"/>
-            </w:tcMar>
-            <w:tcBorders>
-              <w:top w:val="single" w:sz="4" w:color="D9D9D9"/>
-              <w:left w:val="single" w:sz="4" w:color="D9D9D9"/>
-              <w:bottom w:val="single" w:sz="4" w:color="D9D9D9"/>
-              <w:right w:val="single" w:sz="4" w:color="D9D9D9"/>
-            </w:tcBorders>
-          </w:tcPr>
-          <w:p>
-            <w:pPr>
-              <w:spacing w:after="0" w:before="0" w:line="240" w:lineRule="auto"/>
-            </w:pPr>
-            <w:r>
-              <w:rPr>
-                <w:b w:val="0"/>
-                <w:color w:val="242424"/>
-                <w:sz w:val="18"/>
-              </w:rPr>
-              <w:t>US vs international major</w:t>
-            </w:r>
-          </w:p>
-        </w:tc>
-        <w:tc>
-          <w:tcPr>
-            <w:tcW w:type="dxa" w:w="3528"/>
-            <w:vAlign w:val="center"/>
-            <w:shd w:fill="FFFFFF"/>
-            <w:tcMar>
-              <w:top w:w="65" w:type="dxa"/>
-              <w:bottom w:w="65" w:type="dxa"/>
-              <w:left w:w="95" w:type="dxa"/>
-              <w:right w:w="95" w:type="dxa"/>
-            </w:tcMar>
-            <w:tcBorders>
-              <w:top w:val="single" w:sz="4" w:color="D9D9D9"/>
-              <w:left w:val="single" w:sz="4" w:color="D9D9D9"/>
-              <w:bottom w:val="single" w:sz="4" w:color="D9D9D9"/>
-              <w:right w:val="single" w:sz="4" w:color="D9D9D9"/>
-            </w:tcBorders>
-          </w:tcPr>
-          <w:p>
-            <w:pPr>
-              <w:spacing w:after="0" w:before="0" w:line="240" w:lineRule="auto"/>
-            </w:pPr>
-            <w:r>
-              <w:rPr>
-                <w:b w:val="0"/>
-                <w:color w:val="242424"/>
-                <w:sz w:val="18"/>
-              </w:rPr>
-              <w:t>−11.9 pp [−29.0, 5.1]</w:t>
+              <w:t>+17.1 pp [9.5, 24.6]</w:t>
             </w:r>
           </w:p>
         </w:tc>
@@ -4015,77 +3854,8 @@
             <w:vAlign w:val="center"/>
             <w:shd w:fill="FFFFFF"/>
             <w:tcMar>
-              <w:top w:w="65" w:type="dxa"/>
-              <w:bottom w:w="65" w:type="dxa"/>
-              <w:left w:w="95" w:type="dxa"/>
-              <w:right w:w="95" w:type="dxa"/>
-            </w:tcMar>
-            <w:tcBorders>
-              <w:top w:val="single" w:sz="4" w:color="D9D9D9"/>
-              <w:left w:val="single" w:sz="4" w:color="D9D9D9"/>
-              <w:bottom w:val="single" w:sz="4" w:color="D9D9D9"/>
-              <w:right w:val="single" w:sz="4" w:color="D9D9D9"/>
-            </w:tcBorders>
-          </w:tcPr>
-          <w:p>
-            <w:pPr>
-              <w:spacing w:after="0" w:before="0" w:line="240" w:lineRule="auto"/>
-            </w:pPr>
-            <w:r>
-              <w:rPr>
-                <w:b w:val="0"/>
-                <w:color w:val="242424"/>
-                <w:sz w:val="18"/>
-              </w:rPr>
-              <w:t>−6.2 pp [−16.7, 4.4]</w:t>
-            </w:r>
-          </w:p>
-        </w:tc>
-      </w:tr>
-      <w:tr>
-        <w:trPr>
-          <w:cantSplit/>
-        </w:trPr>
-        <w:tc>
-          <w:tcPr>
-            <w:tcW w:type="dxa" w:w="3096"/>
-            <w:vAlign w:val="center"/>
-            <w:shd w:fill="F3F6F5"/>
-            <w:tcMar>
-              <w:top w:w="65" w:type="dxa"/>
-              <w:bottom w:w="65" w:type="dxa"/>
-              <w:left w:w="95" w:type="dxa"/>
-              <w:right w:w="95" w:type="dxa"/>
-            </w:tcMar>
-            <w:tcBorders>
-              <w:top w:val="single" w:sz="4" w:color="D9D9D9"/>
-              <w:left w:val="single" w:sz="4" w:color="D9D9D9"/>
-              <w:bottom w:val="single" w:sz="4" w:color="D9D9D9"/>
-              <w:right w:val="single" w:sz="4" w:color="D9D9D9"/>
-            </w:tcBorders>
-          </w:tcPr>
-          <w:p>
-            <w:pPr>
-              <w:spacing w:after="0" w:before="0" w:line="240" w:lineRule="auto"/>
-            </w:pPr>
-            <w:r>
-              <w:rPr>
-                <w:b w:val="0"/>
-                <w:color w:val="242424"/>
-                <w:sz w:val="18"/>
-              </w:rPr>
-              <w:t>X qualified vs excluded</w:t>
-            </w:r>
-          </w:p>
-        </w:tc>
-        <w:tc>
-          <w:tcPr>
-            <w:tcW w:type="dxa" w:w="3528"/>
-            <w:vAlign w:val="center"/>
-            <w:shd w:fill="F3F6F5"/>
-            <w:tcMar>
-              <w:top w:w="65" w:type="dxa"/>
-              <w:bottom w:w="65" w:type="dxa"/>
+              <w:top w:w="85" w:type="dxa"/>
+              <w:bottom w:w="85" w:type="dxa"/>
               <w:left w:w="95" w:type="dxa"/>
               <w:right w:w="95" w:type="dxa"/>
             </w:tcMar>
@@ -4105,20 +3875,25 @@
               <w:rPr>
                 <w:b w:val="0"/>
                 <w:color w:val="242424"/>
-                <w:sz w:val="18"/>
+                <w:sz w:val="19"/>
               </w:rPr>
-              <w:t>-1.9 pp [-3.8, 0.1]</w:t>
+              <w:t>+7.4 pp [2.4, 12.5]</w:t>
             </w:r>
           </w:p>
         </w:tc>
+      </w:tr>
+      <w:tr>
+        <w:trPr>
+          <w:cantSplit/>
+        </w:trPr>
         <w:tc>
           <w:tcPr>
-            <w:tcW w:type="dxa" w:w="3600"/>
+            <w:tcW w:type="dxa" w:w="3096"/>
             <w:vAlign w:val="center"/>
             <w:shd w:fill="F3F6F5"/>
             <w:tcMar>
-              <w:top w:w="65" w:type="dxa"/>
-              <w:bottom w:w="65" w:type="dxa"/>
+              <w:top w:w="85" w:type="dxa"/>
+              <w:bottom w:w="85" w:type="dxa"/>
               <w:left w:w="95" w:type="dxa"/>
               <w:right w:w="95" w:type="dxa"/>
             </w:tcMar>
@@ -4132,12 +3907,287 @@
           <w:p>
             <w:pPr>
               <w:spacing w:after="0" w:before="0" w:line="240" w:lineRule="auto"/>
+              <w:jc w:val="left"/>
             </w:pPr>
             <w:r>
               <w:rPr>
                 <w:b w:val="0"/>
                 <w:color w:val="242424"/>
-                <w:sz w:val="18"/>
+                <w:sz w:val="19"/>
+              </w:rPr>
+              <w:t>Technology vs corporate</w:t>
+            </w:r>
+          </w:p>
+        </w:tc>
+        <w:tc>
+          <w:tcPr>
+            <w:tcW w:type="dxa" w:w="3528"/>
+            <w:vAlign w:val="center"/>
+            <w:shd w:fill="F3F6F5"/>
+            <w:tcMar>
+              <w:top w:w="85" w:type="dxa"/>
+              <w:bottom w:w="85" w:type="dxa"/>
+              <w:left w:w="95" w:type="dxa"/>
+              <w:right w:w="95" w:type="dxa"/>
+            </w:tcMar>
+            <w:tcBorders>
+              <w:top w:val="single" w:sz="4" w:color="D9D9D9"/>
+              <w:left w:val="single" w:sz="4" w:color="D9D9D9"/>
+              <w:bottom w:val="single" w:sz="4" w:color="D9D9D9"/>
+              <w:right w:val="single" w:sz="4" w:color="D9D9D9"/>
+            </w:tcBorders>
+          </w:tcPr>
+          <w:p>
+            <w:pPr>
+              <w:spacing w:after="0" w:before="0" w:line="240" w:lineRule="auto"/>
+              <w:jc w:val="center"/>
+            </w:pPr>
+            <w:r>
+              <w:rPr>
+                <w:b w:val="0"/>
+                <w:color w:val="242424"/>
+                <w:sz w:val="19"/>
+              </w:rPr>
+              <w:t>+13.4 pp [7.5, 19.3]</w:t>
+            </w:r>
+          </w:p>
+        </w:tc>
+        <w:tc>
+          <w:tcPr>
+            <w:tcW w:type="dxa" w:w="3600"/>
+            <w:vAlign w:val="center"/>
+            <w:shd w:fill="F3F6F5"/>
+            <w:tcMar>
+              <w:top w:w="85" w:type="dxa"/>
+              <w:bottom w:w="85" w:type="dxa"/>
+              <w:left w:w="95" w:type="dxa"/>
+              <w:right w:w="95" w:type="dxa"/>
+            </w:tcMar>
+            <w:tcBorders>
+              <w:top w:val="single" w:sz="4" w:color="D9D9D9"/>
+              <w:left w:val="single" w:sz="4" w:color="D9D9D9"/>
+              <w:bottom w:val="single" w:sz="4" w:color="D9D9D9"/>
+              <w:right w:val="single" w:sz="4" w:color="D9D9D9"/>
+            </w:tcBorders>
+          </w:tcPr>
+          <w:p>
+            <w:pPr>
+              <w:spacing w:after="0" w:before="0" w:line="240" w:lineRule="auto"/>
+              <w:jc w:val="center"/>
+            </w:pPr>
+            <w:r>
+              <w:rPr>
+                <w:b w:val="0"/>
+                <w:color w:val="242424"/>
+                <w:sz w:val="19"/>
+              </w:rPr>
+              <w:t>+12.1 pp [6.6, 17.7]</w:t>
+            </w:r>
+          </w:p>
+        </w:tc>
+      </w:tr>
+      <w:tr>
+        <w:trPr>
+          <w:cantSplit/>
+        </w:trPr>
+        <w:tc>
+          <w:tcPr>
+            <w:tcW w:type="dxa" w:w="3096"/>
+            <w:vAlign w:val="center"/>
+            <w:shd w:fill="FFFFFF"/>
+            <w:tcMar>
+              <w:top w:w="85" w:type="dxa"/>
+              <w:bottom w:w="85" w:type="dxa"/>
+              <w:left w:w="95" w:type="dxa"/>
+              <w:right w:w="95" w:type="dxa"/>
+            </w:tcMar>
+            <w:tcBorders>
+              <w:top w:val="single" w:sz="4" w:color="D9D9D9"/>
+              <w:left w:val="single" w:sz="4" w:color="D9D9D9"/>
+              <w:bottom w:val="single" w:sz="4" w:color="D9D9D9"/>
+              <w:right w:val="single" w:sz="4" w:color="D9D9D9"/>
+            </w:tcBorders>
+          </w:tcPr>
+          <w:p>
+            <w:pPr>
+              <w:spacing w:after="0" w:before="0" w:line="240" w:lineRule="auto"/>
+              <w:jc w:val="left"/>
+            </w:pPr>
+            <w:r>
+              <w:rPr>
+                <w:b w:val="0"/>
+                <w:color w:val="242424"/>
+                <w:sz w:val="19"/>
+              </w:rPr>
+              <w:t>US vs international major</w:t>
+            </w:r>
+          </w:p>
+        </w:tc>
+        <w:tc>
+          <w:tcPr>
+            <w:tcW w:type="dxa" w:w="3528"/>
+            <w:vAlign w:val="center"/>
+            <w:shd w:fill="FFFFFF"/>
+            <w:tcMar>
+              <w:top w:w="85" w:type="dxa"/>
+              <w:bottom w:w="85" w:type="dxa"/>
+              <w:left w:w="95" w:type="dxa"/>
+              <w:right w:w="95" w:type="dxa"/>
+            </w:tcMar>
+            <w:tcBorders>
+              <w:top w:val="single" w:sz="4" w:color="D9D9D9"/>
+              <w:left w:val="single" w:sz="4" w:color="D9D9D9"/>
+              <w:bottom w:val="single" w:sz="4" w:color="D9D9D9"/>
+              <w:right w:val="single" w:sz="4" w:color="D9D9D9"/>
+            </w:tcBorders>
+          </w:tcPr>
+          <w:p>
+            <w:pPr>
+              <w:spacing w:after="0" w:before="0" w:line="240" w:lineRule="auto"/>
+              <w:jc w:val="center"/>
+            </w:pPr>
+            <w:r>
+              <w:rPr>
+                <w:b w:val="0"/>
+                <w:color w:val="242424"/>
+                <w:sz w:val="19"/>
+              </w:rPr>
+              <w:t>−11.9 pp [−29.0, 5.1]</w:t>
+            </w:r>
+          </w:p>
+        </w:tc>
+        <w:tc>
+          <w:tcPr>
+            <w:tcW w:type="dxa" w:w="3600"/>
+            <w:vAlign w:val="center"/>
+            <w:shd w:fill="FFFFFF"/>
+            <w:tcMar>
+              <w:top w:w="85" w:type="dxa"/>
+              <w:bottom w:w="85" w:type="dxa"/>
+              <w:left w:w="95" w:type="dxa"/>
+              <w:right w:w="95" w:type="dxa"/>
+            </w:tcMar>
+            <w:tcBorders>
+              <w:top w:val="single" w:sz="4" w:color="D9D9D9"/>
+              <w:left w:val="single" w:sz="4" w:color="D9D9D9"/>
+              <w:bottom w:val="single" w:sz="4" w:color="D9D9D9"/>
+              <w:right w:val="single" w:sz="4" w:color="D9D9D9"/>
+            </w:tcBorders>
+          </w:tcPr>
+          <w:p>
+            <w:pPr>
+              <w:spacing w:after="0" w:before="0" w:line="240" w:lineRule="auto"/>
+              <w:jc w:val="center"/>
+            </w:pPr>
+            <w:r>
+              <w:rPr>
+                <w:b w:val="0"/>
+                <w:color w:val="242424"/>
+                <w:sz w:val="19"/>
+              </w:rPr>
+              <w:t>−6.2 pp [−16.7, 4.4]</w:t>
+            </w:r>
+          </w:p>
+        </w:tc>
+      </w:tr>
+      <w:tr>
+        <w:trPr>
+          <w:cantSplit/>
+        </w:trPr>
+        <w:tc>
+          <w:tcPr>
+            <w:tcW w:type="dxa" w:w="3096"/>
+            <w:vAlign w:val="center"/>
+            <w:shd w:fill="F3F6F5"/>
+            <w:tcMar>
+              <w:top w:w="85" w:type="dxa"/>
+              <w:bottom w:w="85" w:type="dxa"/>
+              <w:left w:w="95" w:type="dxa"/>
+              <w:right w:w="95" w:type="dxa"/>
+            </w:tcMar>
+            <w:tcBorders>
+              <w:top w:val="single" w:sz="4" w:color="D9D9D9"/>
+              <w:left w:val="single" w:sz="4" w:color="D9D9D9"/>
+              <w:bottom w:val="single" w:sz="4" w:color="D9D9D9"/>
+              <w:right w:val="single" w:sz="4" w:color="D9D9D9"/>
+            </w:tcBorders>
+          </w:tcPr>
+          <w:p>
+            <w:pPr>
+              <w:spacing w:after="0" w:before="0" w:line="240" w:lineRule="auto"/>
+              <w:jc w:val="left"/>
+            </w:pPr>
+            <w:r>
+              <w:rPr>
+                <w:b w:val="0"/>
+                <w:color w:val="242424"/>
+                <w:sz w:val="19"/>
+              </w:rPr>
+              <w:t>X qualified vs excluded</w:t>
+            </w:r>
+          </w:p>
+        </w:tc>
+        <w:tc>
+          <w:tcPr>
+            <w:tcW w:type="dxa" w:w="3528"/>
+            <w:vAlign w:val="center"/>
+            <w:shd w:fill="F3F6F5"/>
+            <w:tcMar>
+              <w:top w:w="85" w:type="dxa"/>
+              <w:bottom w:w="85" w:type="dxa"/>
+              <w:left w:w="95" w:type="dxa"/>
+              <w:right w:w="95" w:type="dxa"/>
+            </w:tcMar>
+            <w:tcBorders>
+              <w:top w:val="single" w:sz="4" w:color="D9D9D9"/>
+              <w:left w:val="single" w:sz="4" w:color="D9D9D9"/>
+              <w:bottom w:val="single" w:sz="4" w:color="D9D9D9"/>
+              <w:right w:val="single" w:sz="4" w:color="D9D9D9"/>
+            </w:tcBorders>
+          </w:tcPr>
+          <w:p>
+            <w:pPr>
+              <w:spacing w:after="0" w:before="0" w:line="240" w:lineRule="auto"/>
+              <w:jc w:val="center"/>
+            </w:pPr>
+            <w:r>
+              <w:rPr>
+                <w:b w:val="0"/>
+                <w:color w:val="242424"/>
+                <w:sz w:val="19"/>
+              </w:rPr>
+              <w:t>-1.9 pp [-3.8, 0.1]</w:t>
+            </w:r>
+          </w:p>
+        </w:tc>
+        <w:tc>
+          <w:tcPr>
+            <w:tcW w:type="dxa" w:w="3600"/>
+            <w:vAlign w:val="center"/>
+            <w:shd w:fill="F3F6F5"/>
+            <w:tcMar>
+              <w:top w:w="85" w:type="dxa"/>
+              <w:bottom w:w="85" w:type="dxa"/>
+              <w:left w:w="95" w:type="dxa"/>
+              <w:right w:w="95" w:type="dxa"/>
+            </w:tcMar>
+            <w:tcBorders>
+              <w:top w:val="single" w:sz="4" w:color="D9D9D9"/>
+              <w:left w:val="single" w:sz="4" w:color="D9D9D9"/>
+              <w:bottom w:val="single" w:sz="4" w:color="D9D9D9"/>
+              <w:right w:val="single" w:sz="4" w:color="D9D9D9"/>
+            </w:tcBorders>
+          </w:tcPr>
+          <w:p>
+            <w:pPr>
+              <w:spacing w:after="0" w:before="0" w:line="240" w:lineRule="auto"/>
+              <w:jc w:val="center"/>
+            </w:pPr>
+            <w:r>
+              <w:rPr>
+                <w:b w:val="0"/>
+                <w:color w:val="242424"/>
+                <w:sz w:val="19"/>
               </w:rPr>
               <w:t>-6.0 pp [-8.0, -3.9]</w:t>
             </w:r>
@@ -4148,6 +4198,7 @@
     <w:p>
       <w:pPr>
         <w:pStyle w:val="Caption"/>
+        <w:spacing w:before="80"/>
       </w:pPr>
       <w:r>
         <w:t>Table 3. Adjusted negative-tone differences and clustered 95% confidence intervals. News: 1,006 headlines, 140 source-domain clusters. X: 12,068 cleaned posts, author clusters. Both use date, topic and length controls; gaps are associations, not causal bias estimates.</w:t>

</xml_diff>